<commit_message>
Added validations...corrected folder structure....jwt token handling
</commit_message>
<xml_diff>
--- a/NodeJS/UrbanBasketApiDocument.docx
+++ b/NodeJS/UrbanBasketApiDocument.docx
@@ -857,8 +857,6 @@
               </w:rPr>
               <w:t>0</w:t>
             </w:r>
-            <w:bookmarkStart w:id="0" w:name="_GoBack"/>
-            <w:bookmarkEnd w:id="0"/>
           </w:p>
         </w:tc>
       </w:tr>
@@ -1543,11 +1541,24 @@
               <w:rPr>
                 <w:rFonts w:hint="default" w:ascii="Calibri" w:hAnsi="Calibri" w:cs="Calibri"/>
               </w:rPr>
-              <w:t>"name":"Monika",</w:t>
+              <w:t>"name":"</w:t>
             </w:r>
             <w:r>
               <w:rPr>
                 <w:rFonts w:hint="default" w:ascii="Calibri" w:hAnsi="Calibri" w:cs="Calibri"/>
+                <w:lang w:val="en-IN"/>
+              </w:rPr>
+              <w:t>Sunny</w:t>
+            </w:r>
+            <w:r>
+              <w:rPr>
+                <w:rFonts w:hint="default" w:ascii="Calibri" w:hAnsi="Calibri" w:cs="Calibri"/>
+              </w:rPr>
+              <w:t>",</w:t>
+            </w:r>
+            <w:r>
+              <w:rPr>
+                <w:rFonts w:hint="default" w:ascii="Calibri" w:hAnsi="Calibri" w:cs="Calibri"/>
               </w:rPr>
               <w:br w:type="textWrapping"/>
             </w:r>
@@ -1555,11 +1566,24 @@
               <w:rPr>
                 <w:rFonts w:hint="default" w:ascii="Calibri" w:hAnsi="Calibri" w:cs="Calibri"/>
               </w:rPr>
-              <w:t>"email":"monika@example.com",</w:t>
+              <w:t>"email":"</w:t>
             </w:r>
             <w:r>
               <w:rPr>
                 <w:rFonts w:hint="default" w:ascii="Calibri" w:hAnsi="Calibri" w:cs="Calibri"/>
+                <w:lang w:val="en-IN"/>
+              </w:rPr>
+              <w:t>Sunny</w:t>
+            </w:r>
+            <w:r>
+              <w:rPr>
+                <w:rFonts w:hint="default" w:ascii="Calibri" w:hAnsi="Calibri" w:cs="Calibri"/>
+              </w:rPr>
+              <w:t>@example.com",</w:t>
+            </w:r>
+            <w:r>
+              <w:rPr>
+                <w:rFonts w:hint="default" w:ascii="Calibri" w:hAnsi="Calibri" w:cs="Calibri"/>
               </w:rPr>
               <w:br w:type="textWrapping"/>
             </w:r>
@@ -1567,7 +1591,20 @@
               <w:rPr>
                 <w:rFonts w:hint="default" w:ascii="Calibri" w:hAnsi="Calibri" w:cs="Calibri"/>
               </w:rPr>
-              <w:t>"password":"Password123"</w:t>
+              <w:t>"password":"Password</w:t>
+            </w:r>
+            <w:r>
+              <w:rPr>
+                <w:rFonts w:hint="default" w:ascii="Calibri" w:hAnsi="Calibri" w:cs="Calibri"/>
+                <w:lang w:val="en-IN"/>
+              </w:rPr>
+              <w:t>@</w:t>
+            </w:r>
+            <w:r>
+              <w:rPr>
+                <w:rFonts w:hint="default" w:ascii="Calibri" w:hAnsi="Calibri" w:cs="Calibri"/>
+              </w:rPr>
+              <w:t>123"</w:t>
             </w:r>
             <w:r>
               <w:rPr>
@@ -1708,7 +1745,7 @@
                             <w:pPr>
                               <w:rPr>
                                 <w:rFonts w:hint="default"/>
-                                <w:lang w:val="en-US"/>
+                                <w:lang w:val="en-IN"/>
                                 <w14:textOutline w14:w="9525">
                                   <w14:solidFill>
                                     <w14:srgbClr w14:val="000000"/>
@@ -1721,7 +1758,7 @@
                             <w:r>
                               <w:rPr>
                                 <w:rFonts w:hint="default"/>
-                                <w:lang w:val="en-US"/>
+                                <w:lang w:val="en-IN"/>
                                 <w14:textOutline w14:w="9525">
                                   <w14:solidFill>
                                     <w14:srgbClr w14:val="000000"/>
@@ -1734,7 +1771,7 @@
                                 <wp:inline distT="0" distB="0" distL="114300" distR="114300">
                                   <wp:extent cx="6203315" cy="3328035"/>
                                   <wp:effectExtent l="0" t="0" r="14605" b="9525"/>
-                                  <wp:docPr id="1" name="Picture 1" descr="test1"/>
+                                  <wp:docPr id="2" name="Picture 2" descr="test1"/>
                                   <wp:cNvGraphicFramePr>
                                     <a:graphicFrameLocks xmlns:a="http://schemas.openxmlformats.org/drawingml/2006/main" noChangeAspect="1"/>
                                   </wp:cNvGraphicFramePr>
@@ -1742,7 +1779,7 @@
                                     <a:graphicData uri="http://schemas.openxmlformats.org/drawingml/2006/picture">
                                       <pic:pic xmlns:pic="http://schemas.openxmlformats.org/drawingml/2006/picture">
                                         <pic:nvPicPr>
-                                          <pic:cNvPr id="1" name="Picture 1" descr="test1"/>
+                                          <pic:cNvPr id="2" name="Picture 2" descr="test1"/>
                                           <pic:cNvPicPr>
                                             <a:picLocks noChangeAspect="1"/>
                                           </pic:cNvPicPr>
@@ -1810,7 +1847,7 @@
                       <w:pPr>
                         <w:rPr>
                           <w:rFonts w:hint="default"/>
-                          <w:lang w:val="en-US"/>
+                          <w:lang w:val="en-IN"/>
                           <w14:textOutline w14:w="9525">
                             <w14:solidFill>
                               <w14:srgbClr w14:val="000000"/>
@@ -1823,7 +1860,7 @@
                       <w:r>
                         <w:rPr>
                           <w:rFonts w:hint="default"/>
-                          <w:lang w:val="en-US"/>
+                          <w:lang w:val="en-IN"/>
                           <w14:textOutline w14:w="9525">
                             <w14:solidFill>
                               <w14:srgbClr w14:val="000000"/>
@@ -1836,7 +1873,7 @@
                           <wp:inline distT="0" distB="0" distL="114300" distR="114300">
                             <wp:extent cx="6203315" cy="3328035"/>
                             <wp:effectExtent l="0" t="0" r="14605" b="9525"/>
-                            <wp:docPr id="1" name="Picture 1" descr="test1"/>
+                            <wp:docPr id="2" name="Picture 2" descr="test1"/>
                             <wp:cNvGraphicFramePr>
                               <a:graphicFrameLocks xmlns:a="http://schemas.openxmlformats.org/drawingml/2006/main" noChangeAspect="1"/>
                             </wp:cNvGraphicFramePr>
@@ -1844,7 +1881,7 @@
                               <a:graphicData uri="http://schemas.openxmlformats.org/drawingml/2006/picture">
                                 <pic:pic xmlns:pic="http://schemas.openxmlformats.org/drawingml/2006/picture">
                                   <pic:nvPicPr>
-                                    <pic:cNvPr id="1" name="Picture 1" descr="test1"/>
+                                    <pic:cNvPr id="2" name="Picture 2" descr="test1"/>
                                     <pic:cNvPicPr>
                                       <a:picLocks noChangeAspect="1"/>
                                     </pic:cNvPicPr>
@@ -2269,11 +2306,24 @@
               <w:rPr>
                 <w:rFonts w:hint="default" w:ascii="Calibri" w:hAnsi="Calibri" w:cs="Calibri"/>
               </w:rPr>
-              <w:t>"email":"monika@example.com",</w:t>
+              <w:t>"email":"</w:t>
             </w:r>
             <w:r>
               <w:rPr>
                 <w:rFonts w:hint="default" w:ascii="Calibri" w:hAnsi="Calibri" w:cs="Calibri"/>
+                <w:lang w:val="en-IN"/>
+              </w:rPr>
+              <w:t>Sunny</w:t>
+            </w:r>
+            <w:r>
+              <w:rPr>
+                <w:rFonts w:hint="default" w:ascii="Calibri" w:hAnsi="Calibri" w:cs="Calibri"/>
+              </w:rPr>
+              <w:t>@example.com",</w:t>
+            </w:r>
+            <w:r>
+              <w:rPr>
+                <w:rFonts w:hint="default" w:ascii="Calibri" w:hAnsi="Calibri" w:cs="Calibri"/>
               </w:rPr>
               <w:br w:type="textWrapping"/>
             </w:r>
@@ -2281,7 +2331,20 @@
               <w:rPr>
                 <w:rFonts w:hint="default" w:ascii="Calibri" w:hAnsi="Calibri" w:cs="Calibri"/>
               </w:rPr>
-              <w:t>"password":"Password123"</w:t>
+              <w:t>"password":"Password</w:t>
+            </w:r>
+            <w:r>
+              <w:rPr>
+                <w:rFonts w:hint="default" w:ascii="Calibri" w:hAnsi="Calibri" w:cs="Calibri"/>
+                <w:lang w:val="en-IN"/>
+              </w:rPr>
+              <w:t>@</w:t>
+            </w:r>
+            <w:r>
+              <w:rPr>
+                <w:rFonts w:hint="default" w:ascii="Calibri" w:hAnsi="Calibri" w:cs="Calibri"/>
+              </w:rPr>
+              <w:t>123"</w:t>
             </w:r>
             <w:r>
               <w:rPr>
@@ -2418,7 +2481,7 @@
                             <w:pPr>
                               <w:rPr>
                                 <w:rFonts w:hint="default"/>
-                                <w:lang w:val="en-US"/>
+                                <w:lang w:val="en-IN"/>
                                 <w14:textOutline w14:w="9525">
                                   <w14:solidFill>
                                     <w14:srgbClr w14:val="000000"/>
@@ -2431,7 +2494,7 @@
                             <w:r>
                               <w:rPr>
                                 <w:rFonts w:hint="default"/>
-                                <w:lang w:val="en-US"/>
+                                <w:lang w:val="en-IN"/>
                                 <w14:textOutline w14:w="9525">
                                   <w14:solidFill>
                                     <w14:srgbClr w14:val="000000"/>
@@ -2444,7 +2507,7 @@
                                 <wp:inline distT="0" distB="0" distL="114300" distR="114300">
                                   <wp:extent cx="6203315" cy="3328035"/>
                                   <wp:effectExtent l="0" t="0" r="14605" b="9525"/>
-                                  <wp:docPr id="25" name="Picture 25" descr="test2"/>
+                                  <wp:docPr id="4" name="Picture 4" descr="test2"/>
                                   <wp:cNvGraphicFramePr>
                                     <a:graphicFrameLocks xmlns:a="http://schemas.openxmlformats.org/drawingml/2006/main" noChangeAspect="1"/>
                                   </wp:cNvGraphicFramePr>
@@ -2452,7 +2515,7 @@
                                     <a:graphicData uri="http://schemas.openxmlformats.org/drawingml/2006/picture">
                                       <pic:pic xmlns:pic="http://schemas.openxmlformats.org/drawingml/2006/picture">
                                         <pic:nvPicPr>
-                                          <pic:cNvPr id="25" name="Picture 25" descr="test2"/>
+                                          <pic:cNvPr id="4" name="Picture 4" descr="test2"/>
                                           <pic:cNvPicPr>
                                             <a:picLocks noChangeAspect="1"/>
                                           </pic:cNvPicPr>
@@ -2520,7 +2583,7 @@
                       <w:pPr>
                         <w:rPr>
                           <w:rFonts w:hint="default"/>
-                          <w:lang w:val="en-US"/>
+                          <w:lang w:val="en-IN"/>
                           <w14:textOutline w14:w="9525">
                             <w14:solidFill>
                               <w14:srgbClr w14:val="000000"/>
@@ -2533,7 +2596,7 @@
                       <w:r>
                         <w:rPr>
                           <w:rFonts w:hint="default"/>
-                          <w:lang w:val="en-US"/>
+                          <w:lang w:val="en-IN"/>
                           <w14:textOutline w14:w="9525">
                             <w14:solidFill>
                               <w14:srgbClr w14:val="000000"/>
@@ -2546,7 +2609,7 @@
                           <wp:inline distT="0" distB="0" distL="114300" distR="114300">
                             <wp:extent cx="6203315" cy="3328035"/>
                             <wp:effectExtent l="0" t="0" r="14605" b="9525"/>
-                            <wp:docPr id="25" name="Picture 25" descr="test2"/>
+                            <wp:docPr id="4" name="Picture 4" descr="test2"/>
                             <wp:cNvGraphicFramePr>
                               <a:graphicFrameLocks xmlns:a="http://schemas.openxmlformats.org/drawingml/2006/main" noChangeAspect="1"/>
                             </wp:cNvGraphicFramePr>
@@ -2554,7 +2617,7 @@
                               <a:graphicData uri="http://schemas.openxmlformats.org/drawingml/2006/picture">
                                 <pic:pic xmlns:pic="http://schemas.openxmlformats.org/drawingml/2006/picture">
                                   <pic:nvPicPr>
-                                    <pic:cNvPr id="25" name="Picture 25" descr="test2"/>
+                                    <pic:cNvPr id="4" name="Picture 4" descr="test2"/>
                                     <pic:cNvPicPr>
                                       <a:picLocks noChangeAspect="1"/>
                                     </pic:cNvPicPr>
@@ -4426,7 +4489,7 @@
                             <w:pPr>
                               <w:rPr>
                                 <w:rFonts w:hint="default"/>
-                                <w:lang w:val="en-US"/>
+                                <w:lang w:val="en-IN"/>
                                 <w14:textOutline w14:w="9525">
                                   <w14:solidFill>
                                     <w14:srgbClr w14:val="000000"/>
@@ -4439,7 +4502,7 @@
                             <w:r>
                               <w:rPr>
                                 <w:rFonts w:hint="default"/>
-                                <w:lang w:val="en-US"/>
+                                <w:lang w:val="en-IN"/>
                                 <w14:textOutline w14:w="9525">
                                   <w14:solidFill>
                                     <w14:srgbClr w14:val="000000"/>
@@ -4452,7 +4515,7 @@
                                 <wp:inline distT="0" distB="0" distL="114300" distR="114300">
                                   <wp:extent cx="6203315" cy="3328035"/>
                                   <wp:effectExtent l="0" t="0" r="14605" b="9525"/>
-                                  <wp:docPr id="30" name="Picture 30" descr="test6"/>
+                                  <wp:docPr id="6" name="Picture 6" descr="test5"/>
                                   <wp:cNvGraphicFramePr>
                                     <a:graphicFrameLocks xmlns:a="http://schemas.openxmlformats.org/drawingml/2006/main" noChangeAspect="1"/>
                                   </wp:cNvGraphicFramePr>
@@ -4460,7 +4523,7 @@
                                     <a:graphicData uri="http://schemas.openxmlformats.org/drawingml/2006/picture">
                                       <pic:pic xmlns:pic="http://schemas.openxmlformats.org/drawingml/2006/picture">
                                         <pic:nvPicPr>
-                                          <pic:cNvPr id="30" name="Picture 30" descr="test6"/>
+                                          <pic:cNvPr id="6" name="Picture 6" descr="test5"/>
                                           <pic:cNvPicPr>
                                             <a:picLocks noChangeAspect="1"/>
                                           </pic:cNvPicPr>
@@ -4528,7 +4591,7 @@
                       <w:pPr>
                         <w:rPr>
                           <w:rFonts w:hint="default"/>
-                          <w:lang w:val="en-US"/>
+                          <w:lang w:val="en-IN"/>
                           <w14:textOutline w14:w="9525">
                             <w14:solidFill>
                               <w14:srgbClr w14:val="000000"/>
@@ -4541,7 +4604,7 @@
                       <w:r>
                         <w:rPr>
                           <w:rFonts w:hint="default"/>
-                          <w:lang w:val="en-US"/>
+                          <w:lang w:val="en-IN"/>
                           <w14:textOutline w14:w="9525">
                             <w14:solidFill>
                               <w14:srgbClr w14:val="000000"/>
@@ -4554,7 +4617,7 @@
                           <wp:inline distT="0" distB="0" distL="114300" distR="114300">
                             <wp:extent cx="6203315" cy="3328035"/>
                             <wp:effectExtent l="0" t="0" r="14605" b="9525"/>
-                            <wp:docPr id="30" name="Picture 30" descr="test6"/>
+                            <wp:docPr id="6" name="Picture 6" descr="test5"/>
                             <wp:cNvGraphicFramePr>
                               <a:graphicFrameLocks xmlns:a="http://schemas.openxmlformats.org/drawingml/2006/main" noChangeAspect="1"/>
                             </wp:cNvGraphicFramePr>
@@ -4562,7 +4625,7 @@
                               <a:graphicData uri="http://schemas.openxmlformats.org/drawingml/2006/picture">
                                 <pic:pic xmlns:pic="http://schemas.openxmlformats.org/drawingml/2006/picture">
                                   <pic:nvPicPr>
-                                    <pic:cNvPr id="30" name="Picture 30" descr="test6"/>
+                                    <pic:cNvPr id="6" name="Picture 6" descr="test5"/>
                                     <pic:cNvPicPr>
                                       <a:picLocks noChangeAspect="1"/>
                                     </pic:cNvPicPr>
@@ -5160,7 +5223,7 @@
                             <w:pPr>
                               <w:rPr>
                                 <w:rFonts w:hint="default"/>
-                                <w:lang w:val="en-US"/>
+                                <w:lang w:val="en-IN"/>
                                 <w14:textOutline w14:w="9525">
                                   <w14:solidFill>
                                     <w14:srgbClr w14:val="000000"/>
@@ -5173,7 +5236,7 @@
                             <w:r>
                               <w:rPr>
                                 <w:rFonts w:hint="default"/>
-                                <w:lang w:val="en-US"/>
+                                <w:lang w:val="en-IN"/>
                                 <w14:textOutline w14:w="9525">
                                   <w14:solidFill>
                                     <w14:srgbClr w14:val="000000"/>
@@ -5186,7 +5249,7 @@
                                 <wp:inline distT="0" distB="0" distL="114300" distR="114300">
                                   <wp:extent cx="6203315" cy="3328035"/>
                                   <wp:effectExtent l="0" t="0" r="14605" b="9525"/>
-                                  <wp:docPr id="28" name="Picture 28" descr="test6"/>
+                                  <wp:docPr id="5" name="Picture 5" descr="test6"/>
                                   <wp:cNvGraphicFramePr>
                                     <a:graphicFrameLocks xmlns:a="http://schemas.openxmlformats.org/drawingml/2006/main" noChangeAspect="1"/>
                                   </wp:cNvGraphicFramePr>
@@ -5194,13 +5257,13 @@
                                     <a:graphicData uri="http://schemas.openxmlformats.org/drawingml/2006/picture">
                                       <pic:pic xmlns:pic="http://schemas.openxmlformats.org/drawingml/2006/picture">
                                         <pic:nvPicPr>
-                                          <pic:cNvPr id="28" name="Picture 28" descr="test6"/>
+                                          <pic:cNvPr id="5" name="Picture 5" descr="test6"/>
                                           <pic:cNvPicPr>
                                             <a:picLocks noChangeAspect="1"/>
                                           </pic:cNvPicPr>
                                         </pic:nvPicPr>
                                         <pic:blipFill>
-                                          <a:blip r:embed="rId11"/>
+                                          <a:blip r:embed="rId12"/>
                                           <a:stretch>
                                             <a:fillRect/>
                                           </a:stretch>
@@ -5262,7 +5325,7 @@
                       <w:pPr>
                         <w:rPr>
                           <w:rFonts w:hint="default"/>
-                          <w:lang w:val="en-US"/>
+                          <w:lang w:val="en-IN"/>
                           <w14:textOutline w14:w="9525">
                             <w14:solidFill>
                               <w14:srgbClr w14:val="000000"/>
@@ -5275,7 +5338,7 @@
                       <w:r>
                         <w:rPr>
                           <w:rFonts w:hint="default"/>
-                          <w:lang w:val="en-US"/>
+                          <w:lang w:val="en-IN"/>
                           <w14:textOutline w14:w="9525">
                             <w14:solidFill>
                               <w14:srgbClr w14:val="000000"/>
@@ -5288,7 +5351,7 @@
                           <wp:inline distT="0" distB="0" distL="114300" distR="114300">
                             <wp:extent cx="6203315" cy="3328035"/>
                             <wp:effectExtent l="0" t="0" r="14605" b="9525"/>
-                            <wp:docPr id="28" name="Picture 28" descr="test6"/>
+                            <wp:docPr id="5" name="Picture 5" descr="test6"/>
                             <wp:cNvGraphicFramePr>
                               <a:graphicFrameLocks xmlns:a="http://schemas.openxmlformats.org/drawingml/2006/main" noChangeAspect="1"/>
                             </wp:cNvGraphicFramePr>
@@ -5296,13 +5359,13 @@
                               <a:graphicData uri="http://schemas.openxmlformats.org/drawingml/2006/picture">
                                 <pic:pic xmlns:pic="http://schemas.openxmlformats.org/drawingml/2006/picture">
                                   <pic:nvPicPr>
-                                    <pic:cNvPr id="28" name="Picture 28" descr="test6"/>
+                                    <pic:cNvPr id="5" name="Picture 5" descr="test6"/>
                                     <pic:cNvPicPr>
                                       <a:picLocks noChangeAspect="1"/>
                                     </pic:cNvPicPr>
                                   </pic:nvPicPr>
                                   <pic:blipFill>
-                                    <a:blip r:embed="rId11"/>
+                                    <a:blip r:embed="rId12"/>
                                     <a:stretch>
                                       <a:fillRect/>
                                     </a:stretch>
@@ -5875,7 +5938,7 @@
                             <w:pPr>
                               <w:rPr>
                                 <w:rFonts w:hint="default"/>
-                                <w:lang w:val="en-US"/>
+                                <w:lang w:val="en-IN"/>
                                 <w14:textOutline w14:w="9525">
                                   <w14:solidFill>
                                     <w14:srgbClr w14:val="000000"/>
@@ -5888,7 +5951,7 @@
                             <w:r>
                               <w:rPr>
                                 <w:rFonts w:hint="default"/>
-                                <w:lang w:val="en-US"/>
+                                <w:lang w:val="en-IN"/>
                                 <w14:textOutline w14:w="9525">
                                   <w14:solidFill>
                                     <w14:srgbClr w14:val="000000"/>
@@ -5901,7 +5964,7 @@
                                 <wp:inline distT="0" distB="0" distL="114300" distR="114300">
                                   <wp:extent cx="6203315" cy="3328035"/>
                                   <wp:effectExtent l="0" t="0" r="14605" b="9525"/>
-                                  <wp:docPr id="32" name="Picture 32" descr="test7"/>
+                                  <wp:docPr id="14" name="Picture 14" descr="test7"/>
                                   <wp:cNvGraphicFramePr>
                                     <a:graphicFrameLocks xmlns:a="http://schemas.openxmlformats.org/drawingml/2006/main" noChangeAspect="1"/>
                                   </wp:cNvGraphicFramePr>
@@ -5909,13 +5972,13 @@
                                     <a:graphicData uri="http://schemas.openxmlformats.org/drawingml/2006/picture">
                                       <pic:pic xmlns:pic="http://schemas.openxmlformats.org/drawingml/2006/picture">
                                         <pic:nvPicPr>
-                                          <pic:cNvPr id="32" name="Picture 32" descr="test7"/>
+                                          <pic:cNvPr id="14" name="Picture 14" descr="test7"/>
                                           <pic:cNvPicPr>
                                             <a:picLocks noChangeAspect="1"/>
                                           </pic:cNvPicPr>
                                         </pic:nvPicPr>
                                         <pic:blipFill>
-                                          <a:blip r:embed="rId12"/>
+                                          <a:blip r:embed="rId13"/>
                                           <a:stretch>
                                             <a:fillRect/>
                                           </a:stretch>
@@ -5977,7 +6040,7 @@
                       <w:pPr>
                         <w:rPr>
                           <w:rFonts w:hint="default"/>
-                          <w:lang w:val="en-US"/>
+                          <w:lang w:val="en-IN"/>
                           <w14:textOutline w14:w="9525">
                             <w14:solidFill>
                               <w14:srgbClr w14:val="000000"/>
@@ -5990,7 +6053,7 @@
                       <w:r>
                         <w:rPr>
                           <w:rFonts w:hint="default"/>
-                          <w:lang w:val="en-US"/>
+                          <w:lang w:val="en-IN"/>
                           <w14:textOutline w14:w="9525">
                             <w14:solidFill>
                               <w14:srgbClr w14:val="000000"/>
@@ -6003,7 +6066,7 @@
                           <wp:inline distT="0" distB="0" distL="114300" distR="114300">
                             <wp:extent cx="6203315" cy="3328035"/>
                             <wp:effectExtent l="0" t="0" r="14605" b="9525"/>
-                            <wp:docPr id="32" name="Picture 32" descr="test7"/>
+                            <wp:docPr id="14" name="Picture 14" descr="test7"/>
                             <wp:cNvGraphicFramePr>
                               <a:graphicFrameLocks xmlns:a="http://schemas.openxmlformats.org/drawingml/2006/main" noChangeAspect="1"/>
                             </wp:cNvGraphicFramePr>
@@ -6011,13 +6074,13 @@
                               <a:graphicData uri="http://schemas.openxmlformats.org/drawingml/2006/picture">
                                 <pic:pic xmlns:pic="http://schemas.openxmlformats.org/drawingml/2006/picture">
                                   <pic:nvPicPr>
-                                    <pic:cNvPr id="32" name="Picture 32" descr="test7"/>
+                                    <pic:cNvPr id="14" name="Picture 14" descr="test7"/>
                                     <pic:cNvPicPr>
                                       <a:picLocks noChangeAspect="1"/>
                                     </pic:cNvPicPr>
                                   </pic:nvPicPr>
                                   <pic:blipFill>
-                                    <a:blip r:embed="rId12"/>
+                                    <a:blip r:embed="rId13"/>
                                     <a:stretch>
                                       <a:fillRect/>
                                     </a:stretch>
@@ -6521,7 +6584,7 @@
                             <w:pPr>
                               <w:rPr>
                                 <w:rFonts w:hint="default"/>
-                                <w:lang w:val="en-US"/>
+                                <w:lang w:val="en-IN"/>
                                 <w14:textOutline w14:w="9525">
                                   <w14:solidFill>
                                     <w14:srgbClr w14:val="000000"/>
@@ -6534,7 +6597,7 @@
                             <w:r>
                               <w:rPr>
                                 <w:rFonts w:hint="default"/>
-                                <w:lang w:val="en-US"/>
+                                <w:lang w:val="en-IN"/>
                                 <w14:textOutline w14:w="9525">
                                   <w14:solidFill>
                                     <w14:srgbClr w14:val="000000"/>
@@ -6547,7 +6610,7 @@
                                 <wp:inline distT="0" distB="0" distL="114300" distR="114300">
                                   <wp:extent cx="6203315" cy="3328035"/>
                                   <wp:effectExtent l="0" t="0" r="14605" b="9525"/>
-                                  <wp:docPr id="33" name="Picture 33" descr="test8"/>
+                                  <wp:docPr id="15" name="Picture 15" descr="test8"/>
                                   <wp:cNvGraphicFramePr>
                                     <a:graphicFrameLocks xmlns:a="http://schemas.openxmlformats.org/drawingml/2006/main" noChangeAspect="1"/>
                                   </wp:cNvGraphicFramePr>
@@ -6555,13 +6618,13 @@
                                     <a:graphicData uri="http://schemas.openxmlformats.org/drawingml/2006/picture">
                                       <pic:pic xmlns:pic="http://schemas.openxmlformats.org/drawingml/2006/picture">
                                         <pic:nvPicPr>
-                                          <pic:cNvPr id="33" name="Picture 33" descr="test8"/>
+                                          <pic:cNvPr id="15" name="Picture 15" descr="test8"/>
                                           <pic:cNvPicPr>
                                             <a:picLocks noChangeAspect="1"/>
                                           </pic:cNvPicPr>
                                         </pic:nvPicPr>
                                         <pic:blipFill>
-                                          <a:blip r:embed="rId13"/>
+                                          <a:blip r:embed="rId14"/>
                                           <a:stretch>
                                             <a:fillRect/>
                                           </a:stretch>
@@ -6623,7 +6686,7 @@
                       <w:pPr>
                         <w:rPr>
                           <w:rFonts w:hint="default"/>
-                          <w:lang w:val="en-US"/>
+                          <w:lang w:val="en-IN"/>
                           <w14:textOutline w14:w="9525">
                             <w14:solidFill>
                               <w14:srgbClr w14:val="000000"/>
@@ -6636,7 +6699,7 @@
                       <w:r>
                         <w:rPr>
                           <w:rFonts w:hint="default"/>
-                          <w:lang w:val="en-US"/>
+                          <w:lang w:val="en-IN"/>
                           <w14:textOutline w14:w="9525">
                             <w14:solidFill>
                               <w14:srgbClr w14:val="000000"/>
@@ -6649,7 +6712,7 @@
                           <wp:inline distT="0" distB="0" distL="114300" distR="114300">
                             <wp:extent cx="6203315" cy="3328035"/>
                             <wp:effectExtent l="0" t="0" r="14605" b="9525"/>
-                            <wp:docPr id="33" name="Picture 33" descr="test8"/>
+                            <wp:docPr id="15" name="Picture 15" descr="test8"/>
                             <wp:cNvGraphicFramePr>
                               <a:graphicFrameLocks xmlns:a="http://schemas.openxmlformats.org/drawingml/2006/main" noChangeAspect="1"/>
                             </wp:cNvGraphicFramePr>
@@ -6657,13 +6720,13 @@
                               <a:graphicData uri="http://schemas.openxmlformats.org/drawingml/2006/picture">
                                 <pic:pic xmlns:pic="http://schemas.openxmlformats.org/drawingml/2006/picture">
                                   <pic:nvPicPr>
-                                    <pic:cNvPr id="33" name="Picture 33" descr="test8"/>
+                                    <pic:cNvPr id="15" name="Picture 15" descr="test8"/>
                                     <pic:cNvPicPr>
                                       <a:picLocks noChangeAspect="1"/>
                                     </pic:cNvPicPr>
                                   </pic:nvPicPr>
                                   <pic:blipFill>
-                                    <a:blip r:embed="rId13"/>
+                                    <a:blip r:embed="rId14"/>
                                     <a:stretch>
                                       <a:fillRect/>
                                     </a:stretch>
@@ -7270,7 +7333,7 @@
                                           </pic:cNvPicPr>
                                         </pic:nvPicPr>
                                         <pic:blipFill>
-                                          <a:blip r:embed="rId14"/>
+                                          <a:blip r:embed="rId15"/>
                                           <a:stretch>
                                             <a:fillRect/>
                                           </a:stretch>
@@ -7372,7 +7435,7 @@
                                     </pic:cNvPicPr>
                                   </pic:nvPicPr>
                                   <pic:blipFill>
-                                    <a:blip r:embed="rId14"/>
+                                    <a:blip r:embed="rId15"/>
                                     <a:stretch>
                                       <a:fillRect/>
                                     </a:stretch>
@@ -7978,7 +8041,7 @@
                                           </pic:cNvPicPr>
                                         </pic:nvPicPr>
                                         <pic:blipFill>
-                                          <a:blip r:embed="rId15"/>
+                                          <a:blip r:embed="rId16"/>
                                           <a:stretch>
                                             <a:fillRect/>
                                           </a:stretch>
@@ -8080,7 +8143,7 @@
                                     </pic:cNvPicPr>
                                   </pic:nvPicPr>
                                   <pic:blipFill>
-                                    <a:blip r:embed="rId15"/>
+                                    <a:blip r:embed="rId16"/>
                                     <a:stretch>
                                       <a:fillRect/>
                                     </a:stretch>
@@ -8716,7 +8779,7 @@
                                           </pic:cNvPicPr>
                                         </pic:nvPicPr>
                                         <pic:blipFill>
-                                          <a:blip r:embed="rId16"/>
+                                          <a:blip r:embed="rId17"/>
                                           <a:stretch>
                                             <a:fillRect/>
                                           </a:stretch>
@@ -8818,7 +8881,7 @@
                                     </pic:cNvPicPr>
                                   </pic:nvPicPr>
                                   <pic:blipFill>
-                                    <a:blip r:embed="rId16"/>
+                                    <a:blip r:embed="rId17"/>
                                     <a:stretch>
                                       <a:fillRect/>
                                     </a:stretch>
@@ -8964,7 +9027,10 @@
     </w:p>
     <w:p/>
     <w:p/>
-    <w:p/>
+    <w:p>
+      <w:bookmarkStart w:id="0" w:name="_GoBack"/>
+      <w:bookmarkEnd w:id="0"/>
+    </w:p>
     <w:sectPr>
       <w:pgSz w:w="12240" w:h="15840"/>
       <w:pgMar w:top="1080" w:right="1080" w:bottom="1080" w:left="1080" w:header="708" w:footer="708" w:gutter="0"/>

</xml_diff>

<commit_message>
Update product API validation, add name field support, env setup docs, and database export files
</commit_message>
<xml_diff>
--- a/NodeJS/UrbanBasketApiDocument.docx
+++ b/NodeJS/UrbanBasketApiDocument.docx
@@ -129,7 +129,7 @@
       </w:r>
       <w:r>
         <w:rPr>
-          <w:rStyle w:val="15"/>
+          <w:rStyle w:val="16"/>
           <w:rFonts w:ascii="Arial" w:hAnsi="Arial" w:eastAsia="Arial" w:cs="Arial"/>
           <w:sz w:val="19"/>
           <w:szCs w:val="19"/>
@@ -138,7 +138,7 @@
       </w:r>
       <w:r>
         <w:rPr>
-          <w:rStyle w:val="15"/>
+          <w:rStyle w:val="16"/>
           <w:rFonts w:hint="default" w:cs="Arial"/>
           <w:sz w:val="19"/>
           <w:szCs w:val="19"/>
@@ -291,7 +291,7 @@
             </w:r>
             <w:r>
               <w:rPr>
-                <w:rStyle w:val="15"/>
+                <w:rStyle w:val="16"/>
                 <w:rFonts w:hint="default" w:ascii="Calibri" w:hAnsi="Calibri" w:cs="Calibri"/>
               </w:rPr>
               <w:t>https://github.com/monikamittal-1728/UrbanBasket</w:t>
@@ -357,7 +357,7 @@
             </w:r>
             <w:r>
               <w:rPr>
-                <w:rStyle w:val="15"/>
+                <w:rStyle w:val="16"/>
                 <w:rFonts w:hint="default" w:ascii="Calibri" w:hAnsi="Calibri" w:cs="Calibri"/>
               </w:rPr>
               <w:t>https://github.com/monikamittal-1728/UrbanBasket/tree/main/NodeJS</w:t>
@@ -563,7 +563,7 @@
             </w:r>
             <w:r>
               <w:rPr>
-                <w:rStyle w:val="15"/>
+                <w:rStyle w:val="16"/>
                 <w:rFonts w:hint="default" w:ascii="Calibri" w:hAnsi="Calibri" w:cs="Calibri"/>
               </w:rPr>
               <w:t>https://github.com/monikamittal-1728/UrbanBasket.git</w:t>
@@ -704,7 +704,7 @@
               <w:spacing w:before="40" w:after="100"/>
               <w:rPr>
                 <w:rFonts w:hint="default"/>
-                <w:lang w:val="en-US"/>
+                <w:lang w:val="en-IN"/>
               </w:rPr>
             </w:pPr>
             <w:r>
@@ -713,6 +713,120 @@
                 <w:lang w:val="en-US"/>
               </w:rPr>
               <w:t>npm install</w:t>
+            </w:r>
+          </w:p>
+          <w:p>
+            <w:pPr>
+              <w:spacing w:before="40" w:after="100"/>
+              <w:rPr>
+                <w:rFonts w:hint="default" w:cs="Arial"/>
+                <w:b/>
+                <w:bCs/>
+                <w:color w:val="374151"/>
+                <w:sz w:val="20"/>
+                <w:szCs w:val="20"/>
+                <w:lang w:val="en-IN"/>
+              </w:rPr>
+            </w:pPr>
+            <w:r>
+              <w:rPr>
+                <w:rFonts w:ascii="Arial" w:hAnsi="Arial" w:eastAsia="Arial" w:cs="Arial"/>
+                <w:b/>
+                <w:bCs/>
+                <w:color w:val="374151"/>
+                <w:sz w:val="20"/>
+                <w:szCs w:val="20"/>
+              </w:rPr>
+              <w:t xml:space="preserve">Step </w:t>
+            </w:r>
+            <w:r>
+              <w:rPr>
+                <w:rFonts w:hint="default" w:cs="Arial"/>
+                <w:b/>
+                <w:bCs/>
+                <w:color w:val="374151"/>
+                <w:sz w:val="20"/>
+                <w:szCs w:val="20"/>
+                <w:lang w:val="en-US"/>
+              </w:rPr>
+              <w:t>4</w:t>
+            </w:r>
+            <w:r>
+              <w:rPr>
+                <w:rFonts w:ascii="Arial" w:hAnsi="Arial" w:eastAsia="Arial" w:cs="Arial"/>
+                <w:b/>
+                <w:bCs/>
+                <w:color w:val="374151"/>
+                <w:sz w:val="20"/>
+                <w:szCs w:val="20"/>
+              </w:rPr>
+              <w:t xml:space="preserve"> — :</w:t>
+            </w:r>
+            <w:r>
+              <w:rPr>
+                <w:rFonts w:hint="default" w:cs="Arial"/>
+                <w:b/>
+                <w:bCs/>
+                <w:color w:val="374151"/>
+                <w:sz w:val="20"/>
+                <w:szCs w:val="20"/>
+                <w:lang w:val="en-IN"/>
+              </w:rPr>
+              <w:t xml:space="preserve"> Seed the Database </w:t>
+            </w:r>
+            <w:r>
+              <w:rPr>
+                <w:rFonts w:hint="default" w:cs="Arial"/>
+                <w:b/>
+                <w:bCs/>
+                <w:color w:val="374151"/>
+                <w:sz w:val="15"/>
+                <w:szCs w:val="15"/>
+                <w:lang w:val="en-IN"/>
+              </w:rPr>
+              <w:t>(</w:t>
+            </w:r>
+            <w:r>
+              <w:rPr>
+                <w:rFonts w:hint="default"/>
+                <w:sz w:val="15"/>
+                <w:szCs w:val="15"/>
+                <w:lang w:val="en-IN"/>
+              </w:rPr>
+              <w:t>Run the seed file to populate the Products collection with sample data</w:t>
+            </w:r>
+            <w:r>
+              <w:rPr>
+                <w:rFonts w:hint="default" w:cs="Arial"/>
+                <w:b/>
+                <w:bCs/>
+                <w:color w:val="374151"/>
+                <w:sz w:val="15"/>
+                <w:szCs w:val="15"/>
+                <w:lang w:val="en-IN"/>
+              </w:rPr>
+              <w:t>)</w:t>
+            </w:r>
+          </w:p>
+          <w:p>
+            <w:pPr>
+              <w:spacing w:before="60" w:after="60"/>
+              <w:rPr>
+                <w:rFonts w:hint="default"/>
+                <w:lang w:val="en-IN"/>
+              </w:rPr>
+            </w:pPr>
+            <w:r>
+              <w:rPr>
+                <w:rFonts w:hint="default" w:cs="Arial"/>
+                <w:b/>
+                <w:bCs/>
+                <w:color w:val="374151"/>
+                <w:sz w:val="20"/>
+                <w:szCs w:val="20"/>
+                <w:lang w:val="en-IN"/>
+              </w:rPr>
+              <w:t>Node products.seed.js</w:t>
             </w:r>
           </w:p>
           <w:p>
@@ -738,9 +852,9 @@
                 <w:color w:val="374151"/>
                 <w:sz w:val="20"/>
                 <w:szCs w:val="20"/>
-                <w:lang w:val="en-US"/>
-              </w:rPr>
-              <w:t>4</w:t>
+                <w:lang w:val="en-IN"/>
+              </w:rPr>
+              <w:t>5</w:t>
             </w:r>
             <w:r>
               <w:rPr>
@@ -796,9 +910,9 @@
                 <w:color w:val="374151"/>
                 <w:sz w:val="20"/>
                 <w:szCs w:val="20"/>
-                <w:lang w:val="en-US"/>
-              </w:rPr>
-              <w:t>5</w:t>
+                <w:lang w:val="en-IN"/>
+              </w:rPr>
+              <w:t>6</w:t>
             </w:r>
             <w:r>
               <w:rPr>
@@ -866,6 +980,88 @@
         <w:spacing w:before="100" w:after="0"/>
       </w:pPr>
     </w:p>
+    <w:tbl>
+      <w:tblPr>
+        <w:tblStyle w:val="9"/>
+        <w:tblW w:w="10208" w:type="dxa"/>
+        <w:tblInd w:w="0" w:type="dxa"/>
+        <w:tblBorders>
+          <w:top w:val="single" w:color="auto" w:sz="4" w:space="0"/>
+          <w:left w:val="single" w:color="auto" w:sz="4" w:space="0"/>
+          <w:bottom w:val="single" w:color="auto" w:sz="4" w:space="0"/>
+          <w:right w:val="single" w:color="auto" w:sz="4" w:space="0"/>
+          <w:insideH w:val="single" w:color="auto" w:sz="4" w:space="0"/>
+          <w:insideV w:val="single" w:color="auto" w:sz="4" w:space="0"/>
+        </w:tblBorders>
+        <w:tblLayout w:type="autofit"/>
+        <w:tblCellMar>
+          <w:top w:w="0" w:type="dxa"/>
+          <w:left w:w="10" w:type="dxa"/>
+          <w:bottom w:w="0" w:type="dxa"/>
+          <w:right w:w="10" w:type="dxa"/>
+        </w:tblCellMar>
+      </w:tblPr>
+      <w:tblGrid>
+        <w:gridCol w:w="10208"/>
+      </w:tblGrid>
+      <w:tr>
+        <w:tblPrEx>
+          <w:tblBorders>
+            <w:top w:val="single" w:color="auto" w:sz="4" w:space="0"/>
+            <w:left w:val="single" w:color="auto" w:sz="4" w:space="0"/>
+            <w:bottom w:val="single" w:color="auto" w:sz="4" w:space="0"/>
+            <w:right w:val="single" w:color="auto" w:sz="4" w:space="0"/>
+            <w:insideH w:val="single" w:color="auto" w:sz="4" w:space="0"/>
+            <w:insideV w:val="single" w:color="auto" w:sz="4" w:space="0"/>
+          </w:tblBorders>
+          <w:tblCellMar>
+            <w:top w:w="0" w:type="dxa"/>
+            <w:left w:w="10" w:type="dxa"/>
+            <w:bottom w:w="0" w:type="dxa"/>
+            <w:right w:w="10" w:type="dxa"/>
+          </w:tblCellMar>
+        </w:tblPrEx>
+        <w:tc>
+          <w:tcPr>
+            <w:tcW w:w="10208" w:type="dxa"/>
+            <w:tcBorders>
+              <w:top w:val="single" w:color="CCCCCC" w:sz="0" w:space="0"/>
+              <w:left w:val="single" w:color="CCCCCC" w:sz="0" w:space="0"/>
+              <w:bottom w:val="single" w:color="CCCCCC" w:sz="0" w:space="0"/>
+              <w:right w:val="single" w:color="CCCCCC" w:sz="0" w:space="0"/>
+            </w:tcBorders>
+            <w:shd w:val="clear" w:color="auto" w:fill="F8FAFC"/>
+            <w:tcMar>
+              <w:top w:w="120" w:type="dxa"/>
+              <w:left w:w="200" w:type="dxa"/>
+              <w:bottom w:w="120" w:type="dxa"/>
+              <w:right w:w="200" w:type="dxa"/>
+            </w:tcMar>
+          </w:tcPr>
+          <w:p>
+            <w:pPr>
+              <w:spacing w:before="40" w:after="100"/>
+              <w:rPr>
+                <w:rFonts w:hint="default"/>
+                <w:lang w:val="en-IN"/>
+              </w:rPr>
+            </w:pPr>
+            <w:r>
+              <w:rPr>
+                <w:rFonts w:hint="default" w:cs="Arial"/>
+                <w:b/>
+                <w:bCs/>
+                <w:color w:val="374151"/>
+                <w:sz w:val="20"/>
+                <w:szCs w:val="20"/>
+                <w:lang w:val="en-IN"/>
+              </w:rPr>
+              <w:t>Database export files are provided in “Database-export” folder  in case you need data.</w:t>
+            </w:r>
+          </w:p>
+        </w:tc>
+      </w:tr>
+    </w:tbl>
     <w:p>
       <w:pPr>
         <w:spacing w:before="100" w:after="0"/>
@@ -894,27 +1090,13 @@
     <w:p>
       <w:pPr>
         <w:spacing w:before="100" w:after="0"/>
-      </w:pPr>
-    </w:p>
-    <w:p>
-      <w:pPr>
-        <w:spacing w:before="100" w:after="0"/>
-      </w:pPr>
-    </w:p>
-    <w:p>
-      <w:pPr>
-        <w:spacing w:before="100" w:after="0"/>
-      </w:pPr>
-    </w:p>
-    <w:p>
-      <w:pPr>
-        <w:spacing w:before="100" w:after="0"/>
-      </w:pPr>
-    </w:p>
-    <w:p>
-      <w:pPr>
-        <w:spacing w:before="100" w:after="0"/>
-      </w:pPr>
+        <w:rPr>
+          <w:rFonts w:hint="default"/>
+          <w:lang w:val="en-IN"/>
+        </w:rPr>
+      </w:pPr>
+      <w:bookmarkStart w:id="0" w:name="_GoBack"/>
+      <w:bookmarkEnd w:id="0"/>
     </w:p>
     <w:p>
       <w:pPr>
@@ -985,7 +1167,7 @@
           <wp:inline distT="0" distB="0" distL="114300" distR="114300">
             <wp:extent cx="4210685" cy="2259330"/>
             <wp:effectExtent l="9525" t="9525" r="16510" b="17145"/>
-            <wp:docPr id="50" name="Picture 50" descr="products"/>
+            <wp:docPr id="50" name="Picture 50" descr="C:/Users/mahav/OneDrive/Desktop/Monika final Project/UrbanBasketApi/NodeJS/screenshot/products.pngproducts"/>
             <wp:cNvGraphicFramePr>
               <a:graphicFrameLocks xmlns:a="http://schemas.openxmlformats.org/drawingml/2006/main" noChangeAspect="1"/>
             </wp:cNvGraphicFramePr>
@@ -993,13 +1175,14 @@
               <a:graphicData uri="http://schemas.openxmlformats.org/drawingml/2006/picture">
                 <pic:pic xmlns:pic="http://schemas.openxmlformats.org/drawingml/2006/picture">
                   <pic:nvPicPr>
-                    <pic:cNvPr id="50" name="Picture 50" descr="products"/>
+                    <pic:cNvPr id="50" name="Picture 50" descr="C:/Users/mahav/OneDrive/Desktop/Monika final Project/UrbanBasketApi/NodeJS/screenshot/products.pngproducts"/>
                     <pic:cNvPicPr>
                       <a:picLocks noChangeAspect="1"/>
                     </pic:cNvPicPr>
                   </pic:nvPicPr>
                   <pic:blipFill>
                     <a:blip r:embed="rId4"/>
+                    <a:srcRect l="14" r="14"/>
                     <a:stretch>
                       <a:fillRect/>
                     </a:stretch>
@@ -1771,7 +1954,7 @@
                                 <wp:inline distT="0" distB="0" distL="114300" distR="114300">
                                   <wp:extent cx="6203315" cy="3328035"/>
                                   <wp:effectExtent l="0" t="0" r="14605" b="9525"/>
-                                  <wp:docPr id="2" name="Picture 2" descr="test1"/>
+                                  <wp:docPr id="1" name="Picture 1" descr="test1"/>
                                   <wp:cNvGraphicFramePr>
                                     <a:graphicFrameLocks xmlns:a="http://schemas.openxmlformats.org/drawingml/2006/main" noChangeAspect="1"/>
                                   </wp:cNvGraphicFramePr>
@@ -1779,7 +1962,7 @@
                                     <a:graphicData uri="http://schemas.openxmlformats.org/drawingml/2006/picture">
                                       <pic:pic xmlns:pic="http://schemas.openxmlformats.org/drawingml/2006/picture">
                                         <pic:nvPicPr>
-                                          <pic:cNvPr id="2" name="Picture 2" descr="test1"/>
+                                          <pic:cNvPr id="1" name="Picture 1" descr="test1"/>
                                           <pic:cNvPicPr>
                                             <a:picLocks noChangeAspect="1"/>
                                           </pic:cNvPicPr>
@@ -1873,7 +2056,7 @@
                           <wp:inline distT="0" distB="0" distL="114300" distR="114300">
                             <wp:extent cx="6203315" cy="3328035"/>
                             <wp:effectExtent l="0" t="0" r="14605" b="9525"/>
-                            <wp:docPr id="2" name="Picture 2" descr="test1"/>
+                            <wp:docPr id="1" name="Picture 1" descr="test1"/>
                             <wp:cNvGraphicFramePr>
                               <a:graphicFrameLocks xmlns:a="http://schemas.openxmlformats.org/drawingml/2006/main" noChangeAspect="1"/>
                             </wp:cNvGraphicFramePr>
@@ -1881,7 +2064,7 @@
                               <a:graphicData uri="http://schemas.openxmlformats.org/drawingml/2006/picture">
                                 <pic:pic xmlns:pic="http://schemas.openxmlformats.org/drawingml/2006/picture">
                                   <pic:nvPicPr>
-                                    <pic:cNvPr id="2" name="Picture 2" descr="test1"/>
+                                    <pic:cNvPr id="1" name="Picture 1" descr="test1"/>
                                     <pic:cNvPicPr>
                                       <a:picLocks noChangeAspect="1"/>
                                     </pic:cNvPicPr>
@@ -2409,7 +2592,7 @@
         <mc:AlternateContent>
           <mc:Choice Requires="wps">
             <w:drawing>
-              <wp:anchor distT="0" distB="0" distL="114300" distR="114300" simplePos="0" relativeHeight="251665408" behindDoc="0" locked="0" layoutInCell="1" allowOverlap="1">
+              <wp:anchor distT="0" distB="0" distL="114300" distR="114300" simplePos="0" relativeHeight="251664384" behindDoc="0" locked="0" layoutInCell="1" allowOverlap="1">
                 <wp:simplePos x="0" y="0"/>
                 <wp:positionH relativeFrom="column">
                   <wp:posOffset>-131445</wp:posOffset>
@@ -2507,7 +2690,7 @@
                                 <wp:inline distT="0" distB="0" distL="114300" distR="114300">
                                   <wp:extent cx="6203315" cy="3328035"/>
                                   <wp:effectExtent l="0" t="0" r="14605" b="9525"/>
-                                  <wp:docPr id="4" name="Picture 4" descr="test2"/>
+                                  <wp:docPr id="2" name="Picture 2" descr="test2"/>
                                   <wp:cNvGraphicFramePr>
                                     <a:graphicFrameLocks xmlns:a="http://schemas.openxmlformats.org/drawingml/2006/main" noChangeAspect="1"/>
                                   </wp:cNvGraphicFramePr>
@@ -2515,7 +2698,7 @@
                                     <a:graphicData uri="http://schemas.openxmlformats.org/drawingml/2006/picture">
                                       <pic:pic xmlns:pic="http://schemas.openxmlformats.org/drawingml/2006/picture">
                                         <pic:nvPicPr>
-                                          <pic:cNvPr id="4" name="Picture 4" descr="test2"/>
+                                          <pic:cNvPr id="2" name="Picture 2" descr="test2"/>
                                           <pic:cNvPicPr>
                                             <a:picLocks noChangeAspect="1"/>
                                           </pic:cNvPicPr>
@@ -2555,7 +2738,7 @@
           </mc:Choice>
           <mc:Fallback>
             <w:pict>
-              <v:shape id="_x0000_s1026" o:spid="_x0000_s1026" o:spt="202" type="#_x0000_t202" style="position:absolute;left:0pt;margin-left:-10.35pt;margin-top:4.95pt;height:288.2pt;width:504.1pt;z-index:251665408;mso-width-relative:page;mso-height-relative:page;" fillcolor="#F4F9F5" filled="t" stroked="t" coordsize="21600,21600" o:gfxdata="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">
+              <v:shape id="_x0000_s1026" o:spid="_x0000_s1026" o:spt="202" type="#_x0000_t202" style="position:absolute;left:0pt;margin-left:-10.35pt;margin-top:4.95pt;height:288.2pt;width:504.1pt;z-index:251664384;mso-width-relative:page;mso-height-relative:page;" fillcolor="#F4F9F5" filled="t" stroked="t" coordsize="21600,21600" o:gfxdata="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">
                 <v:fill on="t" focussize="0,0"/>
                 <v:stroke color="#000000 [3213]" joinstyle="round" dashstyle="dash"/>
                 <v:imagedata o:title=""/>
@@ -2609,7 +2792,7 @@
                           <wp:inline distT="0" distB="0" distL="114300" distR="114300">
                             <wp:extent cx="6203315" cy="3328035"/>
                             <wp:effectExtent l="0" t="0" r="14605" b="9525"/>
-                            <wp:docPr id="4" name="Picture 4" descr="test2"/>
+                            <wp:docPr id="2" name="Picture 2" descr="test2"/>
                             <wp:cNvGraphicFramePr>
                               <a:graphicFrameLocks xmlns:a="http://schemas.openxmlformats.org/drawingml/2006/main" noChangeAspect="1"/>
                             </wp:cNvGraphicFramePr>
@@ -2617,7 +2800,7 @@
                               <a:graphicData uri="http://schemas.openxmlformats.org/drawingml/2006/picture">
                                 <pic:pic xmlns:pic="http://schemas.openxmlformats.org/drawingml/2006/picture">
                                   <pic:nvPicPr>
-                                    <pic:cNvPr id="4" name="Picture 4" descr="test2"/>
+                                    <pic:cNvPr id="2" name="Picture 2" descr="test2"/>
                                     <pic:cNvPicPr>
                                       <a:picLocks noChangeAspect="1"/>
                                     </pic:cNvPicPr>
@@ -3165,7 +3348,7 @@
                             <w:pPr>
                               <w:rPr>
                                 <w:rFonts w:hint="default"/>
-                                <w:lang w:val="en-US"/>
+                                <w:lang w:val="en-IN"/>
                                 <w14:textOutline w14:w="9525">
                                   <w14:solidFill>
                                     <w14:srgbClr w14:val="000000"/>
@@ -3178,7 +3361,7 @@
                             <w:r>
                               <w:rPr>
                                 <w:rFonts w:hint="default"/>
-                                <w:lang w:val="en-US"/>
+                                <w:lang w:val="en-IN"/>
                                 <w14:textOutline w14:w="9525">
                                   <w14:solidFill>
                                     <w14:srgbClr w14:val="000000"/>
@@ -3191,7 +3374,7 @@
                                 <wp:inline distT="0" distB="0" distL="114300" distR="114300">
                                   <wp:extent cx="6203315" cy="3328035"/>
                                   <wp:effectExtent l="0" t="0" r="14605" b="9525"/>
-                                  <wp:docPr id="26" name="Picture 26" descr="test3"/>
+                                  <wp:docPr id="4" name="Picture 4" descr="test3"/>
                                   <wp:cNvGraphicFramePr>
                                     <a:graphicFrameLocks xmlns:a="http://schemas.openxmlformats.org/drawingml/2006/main" noChangeAspect="1"/>
                                   </wp:cNvGraphicFramePr>
@@ -3199,7 +3382,7 @@
                                     <a:graphicData uri="http://schemas.openxmlformats.org/drawingml/2006/picture">
                                       <pic:pic xmlns:pic="http://schemas.openxmlformats.org/drawingml/2006/picture">
                                         <pic:nvPicPr>
-                                          <pic:cNvPr id="26" name="Picture 26" descr="test3"/>
+                                          <pic:cNvPr id="4" name="Picture 4" descr="test3"/>
                                           <pic:cNvPicPr>
                                             <a:picLocks noChangeAspect="1"/>
                                           </pic:cNvPicPr>
@@ -3267,7 +3450,7 @@
                       <w:pPr>
                         <w:rPr>
                           <w:rFonts w:hint="default"/>
-                          <w:lang w:val="en-US"/>
+                          <w:lang w:val="en-IN"/>
                           <w14:textOutline w14:w="9525">
                             <w14:solidFill>
                               <w14:srgbClr w14:val="000000"/>
@@ -3280,7 +3463,7 @@
                       <w:r>
                         <w:rPr>
                           <w:rFonts w:hint="default"/>
-                          <w:lang w:val="en-US"/>
+                          <w:lang w:val="en-IN"/>
                           <w14:textOutline w14:w="9525">
                             <w14:solidFill>
                               <w14:srgbClr w14:val="000000"/>
@@ -3293,7 +3476,7 @@
                           <wp:inline distT="0" distB="0" distL="114300" distR="114300">
                             <wp:extent cx="6203315" cy="3328035"/>
                             <wp:effectExtent l="0" t="0" r="14605" b="9525"/>
-                            <wp:docPr id="26" name="Picture 26" descr="test3"/>
+                            <wp:docPr id="4" name="Picture 4" descr="test3"/>
                             <wp:cNvGraphicFramePr>
                               <a:graphicFrameLocks xmlns:a="http://schemas.openxmlformats.org/drawingml/2006/main" noChangeAspect="1"/>
                             </wp:cNvGraphicFramePr>
@@ -3301,7 +3484,7 @@
                               <a:graphicData uri="http://schemas.openxmlformats.org/drawingml/2006/picture">
                                 <pic:pic xmlns:pic="http://schemas.openxmlformats.org/drawingml/2006/picture">
                                   <pic:nvPicPr>
-                                    <pic:cNvPr id="26" name="Picture 26" descr="test3"/>
+                                    <pic:cNvPr id="4" name="Picture 4" descr="test3"/>
                                     <pic:cNvPicPr>
                                       <a:picLocks noChangeAspect="1"/>
                                     </pic:cNvPicPr>
@@ -3627,62 +3810,103 @@
                 <w:sz w:val="20"/>
                 <w:szCs w:val="20"/>
               </w:rPr>
-              <w:t xml:space="preserve">URL:             </w:t>
-            </w:r>
-            <w:r>
-              <w:rPr>
-                <w:rStyle w:val="14"/>
-                <w:rFonts w:hint="default" w:ascii="Calibri" w:hAnsi="Calibri" w:eastAsia="SimSun" w:cs="Calibri"/>
-                <w:sz w:val="24"/>
-                <w:szCs w:val="24"/>
+              <w:t xml:space="preserve">URL:            </w:t>
+            </w:r>
+            <w:r>
+              <w:rPr>
+                <w:rFonts w:hint="default" w:ascii="Calibri" w:hAnsi="Calibri" w:eastAsia="Arial" w:cs="Calibri"/>
+                <w:b/>
+                <w:bCs/>
+                <w:color w:val="374151"/>
+                <w:sz w:val="20"/>
+                <w:szCs w:val="20"/>
+              </w:rPr>
+              <w:t xml:space="preserve"> </w:t>
+            </w:r>
+            <w:r>
+              <w:rPr>
+                <w:rFonts w:hint="default" w:ascii="Calibri" w:hAnsi="Calibri" w:eastAsia="Segoe UI" w:cs="Calibri"/>
+                <w:i w:val="0"/>
+                <w:iCs w:val="0"/>
+                <w:caps w:val="0"/>
+                <w:color w:val="212121"/>
+                <w:spacing w:val="0"/>
+                <w:sz w:val="20"/>
+                <w:szCs w:val="20"/>
+                <w:shd w:val="clear" w:fill="FFFFFF"/>
               </w:rPr>
               <w:fldChar w:fldCharType="begin"/>
             </w:r>
             <w:r>
               <w:rPr>
-                <w:rStyle w:val="14"/>
-                <w:rFonts w:hint="default" w:ascii="Calibri" w:hAnsi="Calibri" w:eastAsia="SimSun" w:cs="Calibri"/>
-                <w:sz w:val="24"/>
-                <w:szCs w:val="24"/>
-              </w:rPr>
-              <w:instrText xml:space="preserve"> HYPERLINK "http://localhost:3000/api/products/6a29d6ee14f2361a2726888d" </w:instrText>
-            </w:r>
-            <w:r>
-              <w:rPr>
-                <w:rStyle w:val="14"/>
-                <w:rFonts w:hint="default" w:ascii="Calibri" w:hAnsi="Calibri" w:eastAsia="SimSun" w:cs="Calibri"/>
-                <w:sz w:val="24"/>
-                <w:szCs w:val="24"/>
+                <w:rFonts w:hint="default" w:ascii="Calibri" w:hAnsi="Calibri" w:eastAsia="Segoe UI" w:cs="Calibri"/>
+                <w:i w:val="0"/>
+                <w:iCs w:val="0"/>
+                <w:caps w:val="0"/>
+                <w:color w:val="212121"/>
+                <w:spacing w:val="0"/>
+                <w:sz w:val="20"/>
+                <w:szCs w:val="20"/>
+                <w:shd w:val="clear" w:fill="FFFFFF"/>
+              </w:rPr>
+              <w:instrText xml:space="preserve"> HYPERLINK "http://localhost:3000/api/products/6a303b0f2b344bd8b4b2e61d" </w:instrText>
+            </w:r>
+            <w:r>
+              <w:rPr>
+                <w:rFonts w:hint="default" w:ascii="Calibri" w:hAnsi="Calibri" w:eastAsia="Segoe UI" w:cs="Calibri"/>
+                <w:i w:val="0"/>
+                <w:iCs w:val="0"/>
+                <w:caps w:val="0"/>
+                <w:color w:val="212121"/>
+                <w:spacing w:val="0"/>
+                <w:sz w:val="20"/>
+                <w:szCs w:val="20"/>
+                <w:shd w:val="clear" w:fill="FFFFFF"/>
               </w:rPr>
               <w:fldChar w:fldCharType="separate"/>
             </w:r>
             <w:r>
               <w:rPr>
-                <w:rStyle w:val="15"/>
-                <w:rFonts w:hint="default" w:ascii="Calibri" w:hAnsi="Calibri" w:eastAsia="SimSun" w:cs="Calibri"/>
-                <w:sz w:val="24"/>
-                <w:szCs w:val="24"/>
-              </w:rPr>
-              <w:t>http://localhost:3000/</w:t>
-            </w:r>
-            <w:r>
-              <w:rPr>
-                <w:rStyle w:val="15"/>
-                <w:rFonts w:hint="default" w:ascii="Calibri" w:hAnsi="Calibri" w:eastAsia="SimSun" w:cs="Calibri"/>
-                <w:sz w:val="24"/>
-                <w:szCs w:val="24"/>
-                <w:lang w:val="en-US"/>
-              </w:rPr>
-              <w:t>api/products/6a29d6ee14f2361a2726888d</w:t>
-            </w:r>
-            <w:r>
-              <w:rPr>
-                <w:rStyle w:val="14"/>
-                <w:rFonts w:hint="default" w:ascii="Calibri" w:hAnsi="Calibri" w:eastAsia="SimSun" w:cs="Calibri"/>
-                <w:sz w:val="24"/>
-                <w:szCs w:val="24"/>
+                <w:rStyle w:val="16"/>
+                <w:rFonts w:hint="default" w:ascii="Calibri" w:hAnsi="Calibri" w:eastAsia="Segoe UI" w:cs="Calibri"/>
+                <w:i w:val="0"/>
+                <w:iCs w:val="0"/>
+                <w:caps w:val="0"/>
+                <w:spacing w:val="0"/>
+                <w:sz w:val="20"/>
+                <w:szCs w:val="20"/>
+                <w:shd w:val="clear" w:fill="FFFFFF"/>
+              </w:rPr>
+              <w:t>http://localhost:3000/api/products/6a303b0f2b344bd8b4b2e61d</w:t>
+            </w:r>
+            <w:r>
+              <w:rPr>
+                <w:rFonts w:hint="default" w:ascii="Calibri" w:hAnsi="Calibri" w:eastAsia="Segoe UI" w:cs="Calibri"/>
+                <w:i w:val="0"/>
+                <w:iCs w:val="0"/>
+                <w:caps w:val="0"/>
+                <w:color w:val="212121"/>
+                <w:spacing w:val="0"/>
+                <w:sz w:val="20"/>
+                <w:szCs w:val="20"/>
+                <w:shd w:val="clear" w:fill="FFFFFF"/>
               </w:rPr>
               <w:fldChar w:fldCharType="end"/>
+            </w:r>
+            <w:r>
+              <w:rPr>
+                <w:rFonts w:hint="default" w:ascii="Calibri" w:hAnsi="Calibri" w:eastAsia="Segoe UI" w:cs="Calibri"/>
+                <w:i w:val="0"/>
+                <w:iCs w:val="0"/>
+                <w:caps w:val="0"/>
+                <w:color w:val="212121"/>
+                <w:spacing w:val="0"/>
+                <w:sz w:val="20"/>
+                <w:szCs w:val="20"/>
+                <w:shd w:val="clear" w:fill="FFFFFF"/>
+                <w:lang w:val="en-IN"/>
+              </w:rPr>
+              <w:t xml:space="preserve"> </w:t>
             </w:r>
             <w:r>
               <w:rPr>
@@ -3692,7 +3916,7 @@
                 <w:szCs w:val="24"/>
                 <w:lang w:val="en-US"/>
               </w:rPr>
-              <w:t xml:space="preserve"> (id)</w:t>
+              <w:t>(id)</w:t>
             </w:r>
           </w:p>
           <w:p>
@@ -3840,7 +4064,7 @@
                             <w:pPr>
                               <w:rPr>
                                 <w:rFonts w:hint="default"/>
-                                <w:lang w:val="en-US"/>
+                                <w:lang w:val="en-IN"/>
                                 <w14:textOutline w14:w="9525">
                                   <w14:solidFill>
                                     <w14:srgbClr w14:val="000000"/>
@@ -3853,7 +4077,7 @@
                             <w:r>
                               <w:rPr>
                                 <w:rFonts w:hint="default"/>
-                                <w:lang w:val="en-US"/>
+                                <w:lang w:val="en-IN"/>
                                 <w14:textOutline w14:w="9525">
                                   <w14:solidFill>
                                     <w14:srgbClr w14:val="000000"/>
@@ -3866,7 +4090,7 @@
                                 <wp:inline distT="0" distB="0" distL="114300" distR="114300">
                                   <wp:extent cx="6203315" cy="3328035"/>
                                   <wp:effectExtent l="0" t="0" r="14605" b="9525"/>
-                                  <wp:docPr id="27" name="Picture 27" descr="test4"/>
+                                  <wp:docPr id="16" name="Picture 16" descr="test4"/>
                                   <wp:cNvGraphicFramePr>
                                     <a:graphicFrameLocks xmlns:a="http://schemas.openxmlformats.org/drawingml/2006/main" noChangeAspect="1"/>
                                   </wp:cNvGraphicFramePr>
@@ -3874,7 +4098,7 @@
                                     <a:graphicData uri="http://schemas.openxmlformats.org/drawingml/2006/picture">
                                       <pic:pic xmlns:pic="http://schemas.openxmlformats.org/drawingml/2006/picture">
                                         <pic:nvPicPr>
-                                          <pic:cNvPr id="27" name="Picture 27" descr="test4"/>
+                                          <pic:cNvPr id="16" name="Picture 16" descr="test4"/>
                                           <pic:cNvPicPr>
                                             <a:picLocks noChangeAspect="1"/>
                                           </pic:cNvPicPr>
@@ -3942,7 +4166,7 @@
                       <w:pPr>
                         <w:rPr>
                           <w:rFonts w:hint="default"/>
-                          <w:lang w:val="en-US"/>
+                          <w:lang w:val="en-IN"/>
                           <w14:textOutline w14:w="9525">
                             <w14:solidFill>
                               <w14:srgbClr w14:val="000000"/>
@@ -3955,7 +4179,7 @@
                       <w:r>
                         <w:rPr>
                           <w:rFonts w:hint="default"/>
-                          <w:lang w:val="en-US"/>
+                          <w:lang w:val="en-IN"/>
                           <w14:textOutline w14:w="9525">
                             <w14:solidFill>
                               <w14:srgbClr w14:val="000000"/>
@@ -3968,7 +4192,7 @@
                           <wp:inline distT="0" distB="0" distL="114300" distR="114300">
                             <wp:extent cx="6203315" cy="3328035"/>
                             <wp:effectExtent l="0" t="0" r="14605" b="9525"/>
-                            <wp:docPr id="27" name="Picture 27" descr="test4"/>
+                            <wp:docPr id="16" name="Picture 16" descr="test4"/>
                             <wp:cNvGraphicFramePr>
                               <a:graphicFrameLocks xmlns:a="http://schemas.openxmlformats.org/drawingml/2006/main" noChangeAspect="1"/>
                             </wp:cNvGraphicFramePr>
@@ -3976,7 +4200,7 @@
                               <a:graphicData uri="http://schemas.openxmlformats.org/drawingml/2006/picture">
                                 <pic:pic xmlns:pic="http://schemas.openxmlformats.org/drawingml/2006/picture">
                                   <pic:nvPicPr>
-                                    <pic:cNvPr id="27" name="Picture 27" descr="test4"/>
+                                    <pic:cNvPr id="16" name="Picture 16" descr="test4"/>
                                     <pic:cNvPicPr>
                                       <a:picLocks noChangeAspect="1"/>
                                     </pic:cNvPicPr>
@@ -4153,11 +4377,6 @@
     </w:p>
     <w:p>
       <w:pPr>
-        <w:spacing w:before="200" w:after="0"/>
-      </w:pPr>
-    </w:p>
-    <w:p>
-      <w:pPr>
         <w:spacing w:before="100" w:after="120"/>
         <w:rPr>
           <w:rFonts w:hint="default"/>
@@ -4183,9 +4402,794 @@
           <w:color w:val="1E3A5F"/>
           <w:sz w:val="24"/>
           <w:szCs w:val="24"/>
+          <w:lang w:val="en-IN"/>
+        </w:rPr>
+        <w:t>5</w:t>
+      </w:r>
+      <w:r>
+        <w:rPr>
+          <w:rFonts w:ascii="Arial" w:hAnsi="Arial" w:eastAsia="Arial" w:cs="Arial"/>
+          <w:b/>
+          <w:bCs/>
+          <w:color w:val="1E3A5F"/>
+          <w:sz w:val="24"/>
+          <w:szCs w:val="24"/>
+        </w:rPr>
+        <w:t xml:space="preserve">  </w:t>
+      </w:r>
+      <w:r>
+        <w:rPr>
+          <w:rFonts w:ascii="Arial" w:hAnsi="Arial" w:eastAsia="Arial" w:cs="Arial"/>
+          <w:b/>
+          <w:bCs/>
+          <w:color w:val="2563EB"/>
+          <w:sz w:val="24"/>
+          <w:szCs w:val="24"/>
+        </w:rPr>
+        <w:t xml:space="preserve">POST </w:t>
+      </w:r>
+      <w:r>
+        <w:rPr>
+          <w:rFonts w:hint="default" w:ascii="Courier New" w:hAnsi="Courier New" w:eastAsia="Courier New" w:cs="Courier New"/>
+          <w:color w:val="1E3A5F"/>
+          <w:sz w:val="22"/>
+          <w:szCs w:val="22"/>
           <w:lang w:val="en-US"/>
         </w:rPr>
-        <w:t>5</w:t>
+        <w:t xml:space="preserve"> - Add Product To Cart</w:t>
+      </w:r>
+    </w:p>
+    <w:tbl>
+      <w:tblPr>
+        <w:tblStyle w:val="9"/>
+        <w:tblW w:w="10077" w:type="dxa"/>
+        <w:tblInd w:w="0" w:type="dxa"/>
+        <w:tblBorders>
+          <w:top w:val="single" w:color="auto" w:sz="4" w:space="0"/>
+          <w:left w:val="single" w:color="auto" w:sz="4" w:space="0"/>
+          <w:bottom w:val="single" w:color="auto" w:sz="4" w:space="0"/>
+          <w:right w:val="single" w:color="auto" w:sz="4" w:space="0"/>
+          <w:insideH w:val="single" w:color="auto" w:sz="4" w:space="0"/>
+          <w:insideV w:val="single" w:color="auto" w:sz="4" w:space="0"/>
+        </w:tblBorders>
+        <w:tblLayout w:type="autofit"/>
+        <w:tblCellMar>
+          <w:top w:w="0" w:type="dxa"/>
+          <w:left w:w="10" w:type="dxa"/>
+          <w:bottom w:w="0" w:type="dxa"/>
+          <w:right w:w="10" w:type="dxa"/>
+        </w:tblCellMar>
+      </w:tblPr>
+      <w:tblGrid>
+        <w:gridCol w:w="10077"/>
+      </w:tblGrid>
+      <w:tr>
+        <w:tblPrEx>
+          <w:tblBorders>
+            <w:top w:val="single" w:color="auto" w:sz="4" w:space="0"/>
+            <w:left w:val="single" w:color="auto" w:sz="4" w:space="0"/>
+            <w:bottom w:val="single" w:color="auto" w:sz="4" w:space="0"/>
+            <w:right w:val="single" w:color="auto" w:sz="4" w:space="0"/>
+            <w:insideH w:val="single" w:color="auto" w:sz="4" w:space="0"/>
+            <w:insideV w:val="single" w:color="auto" w:sz="4" w:space="0"/>
+          </w:tblBorders>
+          <w:tblCellMar>
+            <w:top w:w="0" w:type="dxa"/>
+            <w:left w:w="10" w:type="dxa"/>
+            <w:bottom w:w="0" w:type="dxa"/>
+            <w:right w:w="10" w:type="dxa"/>
+          </w:tblCellMar>
+        </w:tblPrEx>
+        <w:tc>
+          <w:tcPr>
+            <w:tcW w:w="10077" w:type="dxa"/>
+            <w:tcBorders>
+              <w:top w:val="single" w:color="CCCCCC" w:sz="0" w:space="0"/>
+              <w:left w:val="single" w:color="CCCCCC" w:sz="0" w:space="0"/>
+              <w:bottom w:val="single" w:color="CCCCCC" w:sz="0" w:space="0"/>
+              <w:right w:val="single" w:color="CCCCCC" w:sz="0" w:space="0"/>
+            </w:tcBorders>
+            <w:shd w:val="clear" w:color="auto" w:fill="F8FAFC"/>
+            <w:tcMar>
+              <w:top w:w="120" w:type="dxa"/>
+              <w:left w:w="200" w:type="dxa"/>
+              <w:bottom w:w="120" w:type="dxa"/>
+              <w:right w:w="200" w:type="dxa"/>
+            </w:tcMar>
+          </w:tcPr>
+          <w:p>
+            <w:pPr>
+              <w:spacing w:before="60" w:after="60"/>
+            </w:pPr>
+            <w:r>
+              <w:rPr>
+                <w:rFonts w:ascii="Arial" w:hAnsi="Arial" w:eastAsia="Arial" w:cs="Arial"/>
+                <w:b/>
+                <w:bCs/>
+                <w:color w:val="374151"/>
+                <w:sz w:val="20"/>
+                <w:szCs w:val="20"/>
+              </w:rPr>
+              <w:t xml:space="preserve">Method:        </w:t>
+            </w:r>
+            <w:r>
+              <w:rPr>
+                <w:rFonts w:ascii="Arial" w:hAnsi="Arial" w:eastAsia="Arial" w:cs="Arial"/>
+                <w:b/>
+                <w:bCs/>
+                <w:color w:val="2563EB"/>
+                <w:sz w:val="20"/>
+                <w:szCs w:val="20"/>
+              </w:rPr>
+              <w:t>POST</w:t>
+            </w:r>
+          </w:p>
+          <w:p>
+            <w:pPr>
+              <w:spacing w:before="60" w:after="60"/>
+            </w:pPr>
+            <w:r>
+              <w:rPr>
+                <w:rFonts w:ascii="Arial" w:hAnsi="Arial" w:eastAsia="Arial" w:cs="Arial"/>
+                <w:b/>
+                <w:bCs/>
+                <w:color w:val="374151"/>
+                <w:sz w:val="20"/>
+                <w:szCs w:val="20"/>
+              </w:rPr>
+              <w:t xml:space="preserve">URL:             </w:t>
+            </w:r>
+            <w:r>
+              <w:rPr>
+                <w:rStyle w:val="14"/>
+                <w:rFonts w:hint="default" w:ascii="Calibri" w:hAnsi="Calibri" w:eastAsia="SimSun" w:cs="Calibri"/>
+                <w:sz w:val="24"/>
+                <w:szCs w:val="24"/>
+              </w:rPr>
+              <w:t>http://localhost:3000/</w:t>
+            </w:r>
+            <w:r>
+              <w:rPr>
+                <w:rStyle w:val="14"/>
+                <w:rFonts w:hint="default" w:ascii="Calibri" w:hAnsi="Calibri" w:eastAsia="SimSun" w:cs="Calibri"/>
+                <w:sz w:val="24"/>
+                <w:szCs w:val="24"/>
+                <w:lang w:val="en-US"/>
+              </w:rPr>
+              <w:t>api/cart</w:t>
+            </w:r>
+          </w:p>
+          <w:p>
+            <w:pPr>
+              <w:spacing w:before="60" w:after="60"/>
+              <w:rPr>
+                <w:rFonts w:hint="default"/>
+                <w:lang w:val="en-US"/>
+              </w:rPr>
+            </w:pPr>
+            <w:r>
+              <w:rPr>
+                <w:rFonts w:ascii="Arial" w:hAnsi="Arial" w:eastAsia="Arial" w:cs="Arial"/>
+                <w:b/>
+                <w:bCs/>
+                <w:color w:val="374151"/>
+                <w:sz w:val="20"/>
+                <w:szCs w:val="20"/>
+              </w:rPr>
+              <w:t xml:space="preserve">Status:          </w:t>
+            </w:r>
+            <w:r>
+              <w:rPr>
+                <w:rFonts w:ascii="Arial" w:hAnsi="Arial" w:eastAsia="Arial" w:cs="Arial"/>
+                <w:b/>
+                <w:bCs/>
+                <w:color w:val="16A34A"/>
+                <w:sz w:val="20"/>
+                <w:szCs w:val="20"/>
+              </w:rPr>
+              <w:t>20</w:t>
+            </w:r>
+            <w:r>
+              <w:rPr>
+                <w:rFonts w:hint="default" w:cs="Arial"/>
+                <w:b/>
+                <w:bCs/>
+                <w:color w:val="16A34A"/>
+                <w:sz w:val="20"/>
+                <w:szCs w:val="20"/>
+                <w:lang w:val="en-US"/>
+              </w:rPr>
+              <w:t>0 OK</w:t>
+            </w:r>
+          </w:p>
+          <w:p>
+            <w:pPr>
+              <w:spacing w:before="60" w:after="40"/>
+              <w:rPr>
+                <w:rFonts w:hint="default" w:ascii="Arial" w:hAnsi="Arial" w:eastAsia="Arial" w:cs="Arial"/>
+                <w:b/>
+                <w:bCs/>
+                <w:color w:val="374151"/>
+                <w:sz w:val="20"/>
+                <w:szCs w:val="20"/>
+                <w:lang w:val="en-IN"/>
+              </w:rPr>
+            </w:pPr>
+            <w:r>
+              <w:rPr>
+                <w:rFonts w:hint="default" w:cs="Arial"/>
+                <w:b/>
+                <w:bCs/>
+                <w:color w:val="374151"/>
+                <w:sz w:val="20"/>
+                <w:szCs w:val="20"/>
+                <w:lang w:val="en-IN"/>
+              </w:rPr>
+              <w:t>Authorization</w:t>
+            </w:r>
+            <w:r>
+              <w:rPr>
+                <w:rFonts w:ascii="Arial" w:hAnsi="Arial" w:eastAsia="Arial" w:cs="Arial"/>
+                <w:b/>
+                <w:bCs/>
+                <w:color w:val="374151"/>
+                <w:sz w:val="20"/>
+                <w:szCs w:val="20"/>
+              </w:rPr>
+              <w:t>:</w:t>
+            </w:r>
+            <w:r>
+              <w:rPr>
+                <w:rFonts w:hint="default" w:cs="Arial"/>
+                <w:b/>
+                <w:bCs/>
+                <w:color w:val="374151"/>
+                <w:sz w:val="20"/>
+                <w:szCs w:val="20"/>
+                <w:lang w:val="en-IN"/>
+              </w:rPr>
+              <w:t xml:space="preserve"> </w:t>
+            </w:r>
+            <w:r>
+              <w:rPr>
+                <w:rFonts w:hint="default" w:cs="Arial"/>
+                <w:b w:val="0"/>
+                <w:bCs w:val="0"/>
+                <w:color w:val="374151"/>
+                <w:sz w:val="18"/>
+                <w:szCs w:val="18"/>
+                <w:lang w:val="en-IN"/>
+              </w:rPr>
+              <w:t>Bearer &lt;JWT TOKEN&gt;</w:t>
+            </w:r>
+          </w:p>
+          <w:p>
+            <w:pPr>
+              <w:spacing w:before="60" w:after="40"/>
+              <w:rPr>
+                <w:rFonts w:hint="default"/>
+                <w:lang w:val="en-US"/>
+              </w:rPr>
+            </w:pPr>
+            <w:r>
+              <w:rPr>
+                <w:rFonts w:ascii="Arial" w:hAnsi="Arial" w:eastAsia="Arial" w:cs="Arial"/>
+                <w:b/>
+                <w:bCs/>
+                <w:color w:val="374151"/>
+                <w:sz w:val="20"/>
+                <w:szCs w:val="20"/>
+              </w:rPr>
+              <w:t>Request Body:</w:t>
+            </w:r>
+          </w:p>
+          <w:p>
+            <w:pPr>
+              <w:spacing w:before="20" w:after="20"/>
+            </w:pPr>
+            <w:r>
+              <w:rPr>
+                <w:rFonts w:hint="default" w:ascii="Calibri" w:hAnsi="Calibri" w:cs="Calibri"/>
+              </w:rPr>
+              <w:t>{</w:t>
+            </w:r>
+            <w:r>
+              <w:rPr>
+                <w:rFonts w:hint="default" w:ascii="Calibri" w:hAnsi="Calibri" w:cs="Calibri"/>
+              </w:rPr>
+              <w:br w:type="textWrapping"/>
+            </w:r>
+            <w:r>
+              <w:rPr>
+                <w:rFonts w:hint="default" w:ascii="Calibri" w:hAnsi="Calibri" w:cs="Calibri"/>
+              </w:rPr>
+              <w:t>"productId":"</w:t>
+            </w:r>
+            <w:r>
+              <w:rPr>
+                <w:rFonts w:hint="default" w:ascii="Calibri" w:hAnsi="Calibri" w:eastAsia="monospace" w:cs="Calibri"/>
+                <w:i w:val="0"/>
+                <w:iCs w:val="0"/>
+                <w:caps w:val="0"/>
+                <w:color w:val="auto"/>
+                <w:spacing w:val="0"/>
+                <w:sz w:val="14"/>
+                <w:szCs w:val="14"/>
+                <w:shd w:val="clear" w:fill="E8EDEB"/>
+              </w:rPr>
+              <w:t>6a303b0f2b344bd8b4b2e62d</w:t>
+            </w:r>
+            <w:r>
+              <w:rPr>
+                <w:rFonts w:hint="default" w:ascii="Calibri" w:hAnsi="Calibri" w:cs="Calibri"/>
+              </w:rPr>
+              <w:t>",</w:t>
+            </w:r>
+            <w:r>
+              <w:rPr>
+                <w:rFonts w:hint="default" w:ascii="Calibri" w:hAnsi="Calibri" w:cs="Calibri"/>
+              </w:rPr>
+              <w:br w:type="textWrapping"/>
+            </w:r>
+            <w:r>
+              <w:rPr>
+                <w:rFonts w:hint="default" w:ascii="Calibri" w:hAnsi="Calibri" w:cs="Calibri"/>
+              </w:rPr>
+              <w:t>"quantity":2</w:t>
+            </w:r>
+            <w:r>
+              <w:rPr>
+                <w:rFonts w:hint="default" w:ascii="Calibri" w:hAnsi="Calibri" w:cs="Calibri"/>
+              </w:rPr>
+              <w:br w:type="textWrapping"/>
+            </w:r>
+            <w:r>
+              <w:rPr>
+                <w:rFonts w:hint="default" w:ascii="Calibri" w:hAnsi="Calibri" w:cs="Calibri"/>
+              </w:rPr>
+              <w:t>}</w:t>
+            </w:r>
+            <w:r>
+              <w:rPr>
+                <w:rFonts w:hint="default" w:ascii="Calibri" w:hAnsi="Calibri" w:cs="Calibri"/>
+              </w:rPr>
+              <w:br w:type="textWrapping"/>
+            </w:r>
+          </w:p>
+          <w:p>
+            <w:pPr>
+              <w:spacing w:before="80" w:after="40"/>
+            </w:pPr>
+            <w:r>
+              <w:rPr>
+                <w:rFonts w:ascii="Arial" w:hAnsi="Arial" w:eastAsia="Arial" w:cs="Arial"/>
+                <w:b/>
+                <w:bCs/>
+                <w:color w:val="374151"/>
+                <w:sz w:val="20"/>
+                <w:szCs w:val="20"/>
+              </w:rPr>
+              <w:t>Description:</w:t>
+            </w:r>
+          </w:p>
+          <w:p>
+            <w:pPr>
+              <w:spacing w:before="40" w:after="60"/>
+            </w:pPr>
+            <w:r>
+              <w:rPr>
+                <w:rFonts w:hint="default" w:ascii="Calibri" w:hAnsi="Calibri" w:cs="Calibri"/>
+              </w:rPr>
+              <w:t>Add product into shopping cart.</w:t>
+            </w:r>
+          </w:p>
+        </w:tc>
+      </w:tr>
+    </w:tbl>
+    <w:p>
+      <w:pPr>
+        <w:spacing w:before="120" w:after="0"/>
+      </w:pPr>
+      <w:r>
+        <w:rPr>
+          <w:sz w:val="20"/>
+        </w:rPr>
+        <mc:AlternateContent>
+          <mc:Choice Requires="wps">
+            <w:drawing>
+              <wp:anchor distT="0" distB="0" distL="114300" distR="114300" simplePos="0" relativeHeight="251669504" behindDoc="0" locked="0" layoutInCell="1" allowOverlap="1">
+                <wp:simplePos x="0" y="0"/>
+                <wp:positionH relativeFrom="column">
+                  <wp:posOffset>-131445</wp:posOffset>
+                </wp:positionH>
+                <wp:positionV relativeFrom="paragraph">
+                  <wp:posOffset>186055</wp:posOffset>
+                </wp:positionV>
+                <wp:extent cx="6402070" cy="3660140"/>
+                <wp:effectExtent l="4445" t="4445" r="9525" b="8255"/>
+                <wp:wrapNone/>
+                <wp:docPr id="10" name="Text Box 10"/>
+                <wp:cNvGraphicFramePr/>
+                <a:graphic xmlns:a="http://schemas.openxmlformats.org/drawingml/2006/main">
+                  <a:graphicData uri="http://schemas.microsoft.com/office/word/2010/wordprocessingShape">
+                    <wps:wsp>
+                      <wps:cNvSpPr txBox="1"/>
+                      <wps:spPr>
+                        <a:xfrm>
+                          <a:off x="0" y="0"/>
+                          <a:ext cx="6402070" cy="3660140"/>
+                        </a:xfrm>
+                        <a:prstGeom prst="rect">
+                          <a:avLst/>
+                        </a:prstGeom>
+                        <a:solidFill>
+                          <a:srgbClr val="F4F9F5"/>
+                        </a:solidFill>
+                        <a:ln w="9525">
+                          <a:solidFill>
+                            <a:schemeClr val="tx1"/>
+                          </a:solidFill>
+                          <a:prstDash val="dash"/>
+                        </a:ln>
+                      </wps:spPr>
+                      <wps:style>
+                        <a:lnRef idx="0">
+                          <a:schemeClr val="accent1"/>
+                        </a:lnRef>
+                        <a:fillRef idx="0">
+                          <a:schemeClr val="accent1"/>
+                        </a:fillRef>
+                        <a:effectRef idx="0">
+                          <a:schemeClr val="accent1"/>
+                        </a:effectRef>
+                        <a:fontRef idx="minor">
+                          <a:schemeClr val="dk1"/>
+                        </a:fontRef>
+                      </wps:style>
+                      <wps:txbx>
+                        <w:txbxContent>
+                          <w:p>
+                            <w:pPr>
+                              <w:rPr>
+                                <w:rFonts w:hint="default"/>
+                                <w:sz w:val="10"/>
+                                <w:szCs w:val="10"/>
+                                <w:lang w:val="en-US"/>
+                                <w14:textOutline w14:w="9525">
+                                  <w14:solidFill>
+                                    <w14:srgbClr w14:val="000000"/>
+                                  </w14:solidFill>
+                                  <w14:prstDash w14:val="sysDash"/>
+                                  <w14:round/>
+                                </w14:textOutline>
+                              </w:rPr>
+                            </w:pPr>
+                          </w:p>
+                          <w:p>
+                            <w:pPr>
+                              <w:rPr>
+                                <w:rFonts w:hint="default"/>
+                                <w:lang w:val="en-IN"/>
+                                <w14:textOutline w14:w="9525">
+                                  <w14:solidFill>
+                                    <w14:srgbClr w14:val="000000"/>
+                                  </w14:solidFill>
+                                  <w14:prstDash w14:val="sysDash"/>
+                                  <w14:round/>
+                                </w14:textOutline>
+                              </w:rPr>
+                            </w:pPr>
+                            <w:r>
+                              <w:rPr>
+                                <w:rFonts w:hint="default"/>
+                                <w:lang w:val="en-IN"/>
+                                <w14:textOutline w14:w="9525">
+                                  <w14:solidFill>
+                                    <w14:srgbClr w14:val="000000"/>
+                                  </w14:solidFill>
+                                  <w14:prstDash w14:val="sysDash"/>
+                                  <w14:round/>
+                                </w14:textOutline>
+                              </w:rPr>
+                              <w:drawing>
+                                <wp:inline distT="0" distB="0" distL="114300" distR="114300">
+                                  <wp:extent cx="6203315" cy="3328035"/>
+                                  <wp:effectExtent l="0" t="0" r="14605" b="9525"/>
+                                  <wp:docPr id="20" name="Picture 20" descr="test5"/>
+                                  <wp:cNvGraphicFramePr>
+                                    <a:graphicFrameLocks xmlns:a="http://schemas.openxmlformats.org/drawingml/2006/main" noChangeAspect="1"/>
+                                  </wp:cNvGraphicFramePr>
+                                  <a:graphic xmlns:a="http://schemas.openxmlformats.org/drawingml/2006/main">
+                                    <a:graphicData uri="http://schemas.openxmlformats.org/drawingml/2006/picture">
+                                      <pic:pic xmlns:pic="http://schemas.openxmlformats.org/drawingml/2006/picture">
+                                        <pic:nvPicPr>
+                                          <pic:cNvPr id="20" name="Picture 20" descr="test5"/>
+                                          <pic:cNvPicPr>
+                                            <a:picLocks noChangeAspect="1"/>
+                                          </pic:cNvPicPr>
+                                        </pic:nvPicPr>
+                                        <pic:blipFill>
+                                          <a:blip r:embed="rId11"/>
+                                          <a:stretch>
+                                            <a:fillRect/>
+                                          </a:stretch>
+                                        </pic:blipFill>
+                                        <pic:spPr>
+                                          <a:xfrm>
+                                            <a:off x="0" y="0"/>
+                                            <a:ext cx="6203315" cy="3328035"/>
+                                          </a:xfrm>
+                                          <a:prstGeom prst="rect">
+                                            <a:avLst/>
+                                          </a:prstGeom>
+                                        </pic:spPr>
+                                      </pic:pic>
+                                    </a:graphicData>
+                                  </a:graphic>
+                                </wp:inline>
+                              </w:drawing>
+                            </w:r>
+                          </w:p>
+                        </w:txbxContent>
+                      </wps:txbx>
+                      <wps:bodyPr rot="0" spcFirstLastPara="0" vertOverflow="overflow" horzOverflow="overflow" vert="horz" wrap="square" lIns="91440" tIns="45720" rIns="91440" bIns="45720" numCol="1" spcCol="0" rtlCol="0" fromWordArt="0" anchor="t" anchorCtr="0" forceAA="0" compatLnSpc="1">
+                        <a:noAutofit/>
+                      </wps:bodyPr>
+                    </wps:wsp>
+                  </a:graphicData>
+                </a:graphic>
+              </wp:anchor>
+            </w:drawing>
+          </mc:Choice>
+          <mc:Fallback>
+            <w:pict>
+              <v:shape id="_x0000_s1026" o:spid="_x0000_s1026" o:spt="202" type="#_x0000_t202" style="position:absolute;left:0pt;margin-left:-10.35pt;margin-top:14.65pt;height:288.2pt;width:504.1pt;z-index:251669504;mso-width-relative:page;mso-height-relative:page;" fillcolor="#F4F9F5" filled="t" stroked="t" coordsize="21600,21600" o:gfxdata="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">
+                <v:fill on="t" focussize="0,0"/>
+                <v:stroke color="#000000 [3213]" joinstyle="round" dashstyle="dash"/>
+                <v:imagedata o:title=""/>
+                <o:lock v:ext="edit" aspectratio="f"/>
+                <v:textbox>
+                  <w:txbxContent>
+                    <w:p>
+                      <w:pPr>
+                        <w:rPr>
+                          <w:rFonts w:hint="default"/>
+                          <w:sz w:val="10"/>
+                          <w:szCs w:val="10"/>
+                          <w:lang w:val="en-US"/>
+                          <w14:textOutline w14:w="9525">
+                            <w14:solidFill>
+                              <w14:srgbClr w14:val="000000"/>
+                            </w14:solidFill>
+                            <w14:prstDash w14:val="sysDash"/>
+                            <w14:round/>
+                          </w14:textOutline>
+                        </w:rPr>
+                      </w:pPr>
+                    </w:p>
+                    <w:p>
+                      <w:pPr>
+                        <w:rPr>
+                          <w:rFonts w:hint="default"/>
+                          <w:lang w:val="en-IN"/>
+                          <w14:textOutline w14:w="9525">
+                            <w14:solidFill>
+                              <w14:srgbClr w14:val="000000"/>
+                            </w14:solidFill>
+                            <w14:prstDash w14:val="sysDash"/>
+                            <w14:round/>
+                          </w14:textOutline>
+                        </w:rPr>
+                      </w:pPr>
+                      <w:r>
+                        <w:rPr>
+                          <w:rFonts w:hint="default"/>
+                          <w:lang w:val="en-IN"/>
+                          <w14:textOutline w14:w="9525">
+                            <w14:solidFill>
+                              <w14:srgbClr w14:val="000000"/>
+                            </w14:solidFill>
+                            <w14:prstDash w14:val="sysDash"/>
+                            <w14:round/>
+                          </w14:textOutline>
+                        </w:rPr>
+                        <w:drawing>
+                          <wp:inline distT="0" distB="0" distL="114300" distR="114300">
+                            <wp:extent cx="6203315" cy="3328035"/>
+                            <wp:effectExtent l="0" t="0" r="14605" b="9525"/>
+                            <wp:docPr id="20" name="Picture 20" descr="test5"/>
+                            <wp:cNvGraphicFramePr>
+                              <a:graphicFrameLocks xmlns:a="http://schemas.openxmlformats.org/drawingml/2006/main" noChangeAspect="1"/>
+                            </wp:cNvGraphicFramePr>
+                            <a:graphic xmlns:a="http://schemas.openxmlformats.org/drawingml/2006/main">
+                              <a:graphicData uri="http://schemas.openxmlformats.org/drawingml/2006/picture">
+                                <pic:pic xmlns:pic="http://schemas.openxmlformats.org/drawingml/2006/picture">
+                                  <pic:nvPicPr>
+                                    <pic:cNvPr id="20" name="Picture 20" descr="test5"/>
+                                    <pic:cNvPicPr>
+                                      <a:picLocks noChangeAspect="1"/>
+                                    </pic:cNvPicPr>
+                                  </pic:nvPicPr>
+                                  <pic:blipFill>
+                                    <a:blip r:embed="rId11"/>
+                                    <a:stretch>
+                                      <a:fillRect/>
+                                    </a:stretch>
+                                  </pic:blipFill>
+                                  <pic:spPr>
+                                    <a:xfrm>
+                                      <a:off x="0" y="0"/>
+                                      <a:ext cx="6203315" cy="3328035"/>
+                                    </a:xfrm>
+                                    <a:prstGeom prst="rect">
+                                      <a:avLst/>
+                                    </a:prstGeom>
+                                  </pic:spPr>
+                                </pic:pic>
+                              </a:graphicData>
+                            </a:graphic>
+                          </wp:inline>
+                        </w:drawing>
+                      </w:r>
+                    </w:p>
+                  </w:txbxContent>
+                </v:textbox>
+              </v:shape>
+            </w:pict>
+          </mc:Fallback>
+        </mc:AlternateContent>
+      </w:r>
+    </w:p>
+    <w:p>
+      <w:pPr>
+        <w:spacing w:before="120" w:after="0"/>
+      </w:pPr>
+    </w:p>
+    <w:p>
+      <w:pPr>
+        <w:spacing w:before="120" w:after="0"/>
+      </w:pPr>
+    </w:p>
+    <w:p>
+      <w:pPr>
+        <w:spacing w:before="120" w:after="0"/>
+      </w:pPr>
+    </w:p>
+    <w:p>
+      <w:pPr>
+        <w:spacing w:before="120" w:after="0"/>
+      </w:pPr>
+    </w:p>
+    <w:p>
+      <w:pPr>
+        <w:spacing w:before="120" w:after="0"/>
+      </w:pPr>
+    </w:p>
+    <w:p>
+      <w:pPr>
+        <w:spacing w:before="120" w:after="0"/>
+      </w:pPr>
+    </w:p>
+    <w:p>
+      <w:pPr>
+        <w:spacing w:before="120" w:after="0"/>
+      </w:pPr>
+    </w:p>
+    <w:p>
+      <w:pPr>
+        <w:spacing w:before="120" w:after="0"/>
+      </w:pPr>
+    </w:p>
+    <w:p>
+      <w:pPr>
+        <w:spacing w:before="120" w:after="0"/>
+      </w:pPr>
+    </w:p>
+    <w:p>
+      <w:pPr>
+        <w:spacing w:before="120" w:after="0"/>
+      </w:pPr>
+    </w:p>
+    <w:p>
+      <w:pPr>
+        <w:spacing w:before="120" w:after="0"/>
+      </w:pPr>
+    </w:p>
+    <w:p>
+      <w:pPr>
+        <w:spacing w:before="120" w:after="0"/>
+      </w:pPr>
+    </w:p>
+    <w:p>
+      <w:pPr>
+        <w:spacing w:before="120" w:after="0"/>
+      </w:pPr>
+    </w:p>
+    <w:p>
+      <w:pPr>
+        <w:spacing w:before="120" w:after="0"/>
+      </w:pPr>
+    </w:p>
+    <w:p>
+      <w:pPr>
+        <w:spacing w:before="120" w:after="0"/>
+      </w:pPr>
+    </w:p>
+    <w:p>
+      <w:pPr>
+        <w:spacing w:before="120" w:after="0"/>
+      </w:pPr>
+    </w:p>
+    <w:p>
+      <w:pPr>
+        <w:spacing w:before="120" w:after="0"/>
+      </w:pPr>
+    </w:p>
+    <w:p>
+      <w:pPr>
+        <w:spacing w:before="120" w:after="0"/>
+      </w:pPr>
+    </w:p>
+    <w:p>
+      <w:pPr>
+        <w:spacing w:before="200" w:after="0"/>
+      </w:pPr>
+    </w:p>
+    <w:p>
+      <w:pPr>
+        <w:spacing w:before="200" w:after="0"/>
+      </w:pPr>
+    </w:p>
+    <w:p>
+      <w:pPr>
+        <w:spacing w:before="200" w:after="0"/>
+      </w:pPr>
+    </w:p>
+    <w:p>
+      <w:pPr>
+        <w:spacing w:before="200" w:after="0"/>
+      </w:pPr>
+    </w:p>
+    <w:p>
+      <w:pPr>
+        <w:spacing w:before="200" w:after="0"/>
+      </w:pPr>
+    </w:p>
+    <w:p>
+      <w:pPr>
+        <w:spacing w:before="200" w:after="0"/>
+      </w:pPr>
+    </w:p>
+    <w:p>
+      <w:pPr>
+        <w:spacing w:before="100" w:after="120"/>
+        <w:rPr>
+          <w:rFonts w:hint="default"/>
+          <w:lang w:val="en-US"/>
+        </w:rPr>
+      </w:pPr>
+      <w:r>
+        <w:rPr>
+          <w:rFonts w:ascii="Arial" w:hAnsi="Arial" w:eastAsia="Arial" w:cs="Arial"/>
+          <w:b/>
+          <w:bCs/>
+          <w:color w:val="1E3A5F"/>
+          <w:sz w:val="24"/>
+          <w:szCs w:val="24"/>
+        </w:rPr>
+        <w:t xml:space="preserve">Test Case </w:t>
+      </w:r>
+      <w:r>
+        <w:rPr>
+          <w:rFonts w:hint="default" w:cs="Arial"/>
+          <w:b/>
+          <w:bCs/>
+          <w:color w:val="1E3A5F"/>
+          <w:sz w:val="24"/>
+          <w:szCs w:val="24"/>
+          <w:lang w:val="en-IN"/>
+        </w:rPr>
+        <w:t>6</w:t>
       </w:r>
       <w:r>
         <w:rPr>
@@ -4347,6 +5351,14 @@
           <w:p>
             <w:pPr>
               <w:spacing w:before="60" w:after="60"/>
+              <w:rPr>
+                <w:rFonts w:ascii="Arial" w:hAnsi="Arial" w:eastAsia="Arial" w:cs="Arial"/>
+                <w:b/>
+                <w:bCs/>
+                <w:color w:val="374151"/>
+                <w:sz w:val="20"/>
+                <w:szCs w:val="20"/>
+              </w:rPr>
             </w:pPr>
             <w:r>
               <w:rPr>
@@ -4369,6 +5381,67 @@
                 <w:szCs w:val="20"/>
               </w:rPr>
               <w:t>200 OK</w:t>
+            </w:r>
+          </w:p>
+          <w:p>
+            <w:pPr>
+              <w:spacing w:before="60" w:after="40"/>
+              <w:rPr>
+                <w:rFonts w:hint="default" w:ascii="Arial" w:hAnsi="Arial" w:eastAsia="Arial" w:cs="Arial"/>
+                <w:b/>
+                <w:bCs/>
+                <w:color w:val="374151"/>
+                <w:sz w:val="20"/>
+                <w:szCs w:val="20"/>
+                <w:lang w:val="en-IN"/>
+              </w:rPr>
+            </w:pPr>
+            <w:r>
+              <w:rPr>
+                <w:rFonts w:hint="default" w:cs="Arial"/>
+                <w:b/>
+                <w:bCs/>
+                <w:color w:val="374151"/>
+                <w:sz w:val="20"/>
+                <w:szCs w:val="20"/>
+                <w:lang w:val="en-IN"/>
+              </w:rPr>
+              <w:t>Authorization</w:t>
+            </w:r>
+            <w:r>
+              <w:rPr>
+                <w:rFonts w:ascii="Arial" w:hAnsi="Arial" w:eastAsia="Arial" w:cs="Arial"/>
+                <w:b/>
+                <w:bCs/>
+                <w:color w:val="374151"/>
+                <w:sz w:val="20"/>
+                <w:szCs w:val="20"/>
+              </w:rPr>
+              <w:t>:</w:t>
+            </w:r>
+            <w:r>
+              <w:rPr>
+                <w:rFonts w:hint="default" w:cs="Arial"/>
+                <w:b/>
+                <w:bCs/>
+                <w:color w:val="374151"/>
+                <w:sz w:val="20"/>
+                <w:szCs w:val="20"/>
+                <w:lang w:val="en-IN"/>
+              </w:rPr>
+              <w:t xml:space="preserve"> </w:t>
+            </w:r>
+            <w:r>
+              <w:rPr>
+                <w:rFonts w:hint="default" w:cs="Arial"/>
+                <w:b w:val="0"/>
+                <w:bCs w:val="0"/>
+                <w:color w:val="374151"/>
+                <w:sz w:val="18"/>
+                <w:szCs w:val="18"/>
+                <w:lang w:val="en-IN"/>
+              </w:rPr>
+              <w:t>Bearer &lt;JWT TOKEN&gt;</w:t>
             </w:r>
           </w:p>
           <w:p>
@@ -4417,7 +5490,7 @@
         <mc:AlternateContent>
           <mc:Choice Requires="wps">
             <w:drawing>
-              <wp:anchor distT="0" distB="0" distL="114300" distR="114300" simplePos="0" relativeHeight="251666432" behindDoc="0" locked="0" layoutInCell="1" allowOverlap="1">
+              <wp:anchor distT="0" distB="0" distL="114300" distR="114300" simplePos="0" relativeHeight="251665408" behindDoc="0" locked="0" layoutInCell="1" allowOverlap="1">
                 <wp:simplePos x="0" y="0"/>
                 <wp:positionH relativeFrom="column">
                   <wp:posOffset>-92710</wp:posOffset>
@@ -4515,7 +5588,7 @@
                                 <wp:inline distT="0" distB="0" distL="114300" distR="114300">
                                   <wp:extent cx="6203315" cy="3328035"/>
                                   <wp:effectExtent l="0" t="0" r="14605" b="9525"/>
-                                  <wp:docPr id="6" name="Picture 6" descr="test5"/>
+                                  <wp:docPr id="21" name="Picture 21" descr="test6"/>
                                   <wp:cNvGraphicFramePr>
                                     <a:graphicFrameLocks xmlns:a="http://schemas.openxmlformats.org/drawingml/2006/main" noChangeAspect="1"/>
                                   </wp:cNvGraphicFramePr>
@@ -4523,13 +5596,13 @@
                                     <a:graphicData uri="http://schemas.openxmlformats.org/drawingml/2006/picture">
                                       <pic:pic xmlns:pic="http://schemas.openxmlformats.org/drawingml/2006/picture">
                                         <pic:nvPicPr>
-                                          <pic:cNvPr id="6" name="Picture 6" descr="test5"/>
+                                          <pic:cNvPr id="21" name="Picture 21" descr="test6"/>
                                           <pic:cNvPicPr>
                                             <a:picLocks noChangeAspect="1"/>
                                           </pic:cNvPicPr>
                                         </pic:nvPicPr>
                                         <pic:blipFill>
-                                          <a:blip r:embed="rId11"/>
+                                          <a:blip r:embed="rId12"/>
                                           <a:stretch>
                                             <a:fillRect/>
                                           </a:stretch>
@@ -4563,7 +5636,7 @@
           </mc:Choice>
           <mc:Fallback>
             <w:pict>
-              <v:shape id="_x0000_s1026" o:spid="_x0000_s1026" o:spt="202" type="#_x0000_t202" style="position:absolute;left:0pt;margin-left:-7.3pt;margin-top:13.2pt;height:288.2pt;width:504.1pt;z-index:251666432;mso-width-relative:page;mso-height-relative:page;" fillcolor="#F4F9F5" filled="t" stroked="t" coordsize="21600,21600" o:gfxdata="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">
+              <v:shape id="_x0000_s1026" o:spid="_x0000_s1026" o:spt="202" type="#_x0000_t202" style="position:absolute;left:0pt;margin-left:-7.3pt;margin-top:13.2pt;height:288.2pt;width:504.1pt;z-index:251665408;mso-width-relative:page;mso-height-relative:page;" fillcolor="#F4F9F5" filled="t" stroked="t" coordsize="21600,21600" o:gfxdata="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">
                 <v:fill on="t" focussize="0,0"/>
                 <v:stroke color="#000000 [3213]" joinstyle="round" dashstyle="dash"/>
                 <v:imagedata o:title=""/>
@@ -4617,7 +5690,7 @@
                           <wp:inline distT="0" distB="0" distL="114300" distR="114300">
                             <wp:extent cx="6203315" cy="3328035"/>
                             <wp:effectExtent l="0" t="0" r="14605" b="9525"/>
-                            <wp:docPr id="6" name="Picture 6" descr="test5"/>
+                            <wp:docPr id="21" name="Picture 21" descr="test6"/>
                             <wp:cNvGraphicFramePr>
                               <a:graphicFrameLocks xmlns:a="http://schemas.openxmlformats.org/drawingml/2006/main" noChangeAspect="1"/>
                             </wp:cNvGraphicFramePr>
@@ -4625,741 +5698,7 @@
                               <a:graphicData uri="http://schemas.openxmlformats.org/drawingml/2006/picture">
                                 <pic:pic xmlns:pic="http://schemas.openxmlformats.org/drawingml/2006/picture">
                                   <pic:nvPicPr>
-                                    <pic:cNvPr id="6" name="Picture 6" descr="test5"/>
-                                    <pic:cNvPicPr>
-                                      <a:picLocks noChangeAspect="1"/>
-                                    </pic:cNvPicPr>
-                                  </pic:nvPicPr>
-                                  <pic:blipFill>
-                                    <a:blip r:embed="rId11"/>
-                                    <a:stretch>
-                                      <a:fillRect/>
-                                    </a:stretch>
-                                  </pic:blipFill>
-                                  <pic:spPr>
-                                    <a:xfrm>
-                                      <a:off x="0" y="0"/>
-                                      <a:ext cx="6203315" cy="3328035"/>
-                                    </a:xfrm>
-                                    <a:prstGeom prst="rect">
-                                      <a:avLst/>
-                                    </a:prstGeom>
-                                  </pic:spPr>
-                                </pic:pic>
-                              </a:graphicData>
-                            </a:graphic>
-                          </wp:inline>
-                        </w:drawing>
-                      </w:r>
-                    </w:p>
-                  </w:txbxContent>
-                </v:textbox>
-              </v:shape>
-            </w:pict>
-          </mc:Fallback>
-        </mc:AlternateContent>
-      </w:r>
-    </w:p>
-    <w:p>
-      <w:pPr>
-        <w:spacing w:before="200" w:after="0"/>
-      </w:pPr>
-    </w:p>
-    <w:p>
-      <w:pPr>
-        <w:spacing w:before="200" w:after="0"/>
-      </w:pPr>
-    </w:p>
-    <w:p>
-      <w:pPr>
-        <w:spacing w:before="200" w:after="0"/>
-      </w:pPr>
-    </w:p>
-    <w:p>
-      <w:pPr>
-        <w:spacing w:before="200" w:after="0"/>
-      </w:pPr>
-    </w:p>
-    <w:p>
-      <w:pPr>
-        <w:spacing w:before="200" w:after="0"/>
-      </w:pPr>
-    </w:p>
-    <w:p>
-      <w:pPr>
-        <w:spacing w:before="200" w:after="0"/>
-      </w:pPr>
-    </w:p>
-    <w:p>
-      <w:pPr>
-        <w:spacing w:before="200" w:after="0"/>
-      </w:pPr>
-    </w:p>
-    <w:p>
-      <w:pPr>
-        <w:spacing w:before="200" w:after="0"/>
-      </w:pPr>
-    </w:p>
-    <w:p>
-      <w:pPr>
-        <w:spacing w:before="200" w:after="0"/>
-      </w:pPr>
-    </w:p>
-    <w:p>
-      <w:pPr>
-        <w:spacing w:before="200" w:after="0"/>
-      </w:pPr>
-    </w:p>
-    <w:p>
-      <w:pPr>
-        <w:spacing w:before="200" w:after="0"/>
-      </w:pPr>
-    </w:p>
-    <w:p>
-      <w:pPr>
-        <w:spacing w:before="200" w:after="0"/>
-      </w:pPr>
-    </w:p>
-    <w:p>
-      <w:pPr>
-        <w:spacing w:before="200" w:after="0"/>
-      </w:pPr>
-    </w:p>
-    <w:p>
-      <w:pPr>
-        <w:spacing w:before="200" w:after="0"/>
-      </w:pPr>
-    </w:p>
-    <w:p>
-      <w:pPr>
-        <w:spacing w:before="200" w:after="0"/>
-      </w:pPr>
-    </w:p>
-    <w:p>
-      <w:pPr>
-        <w:spacing w:before="200" w:after="0"/>
-      </w:pPr>
-    </w:p>
-    <w:p>
-      <w:pPr>
-        <w:spacing w:before="200" w:after="0"/>
-      </w:pPr>
-    </w:p>
-    <w:p>
-      <w:pPr>
-        <w:spacing w:before="200" w:after="0"/>
-      </w:pPr>
-    </w:p>
-    <w:p>
-      <w:pPr>
-        <w:spacing w:before="200" w:after="0"/>
-      </w:pPr>
-    </w:p>
-    <w:p>
-      <w:pPr>
-        <w:spacing w:before="200" w:after="0"/>
-      </w:pPr>
-    </w:p>
-    <w:p>
-      <w:pPr>
-        <w:spacing w:before="200" w:after="0"/>
-      </w:pPr>
-    </w:p>
-    <w:p>
-      <w:pPr>
-        <w:spacing w:before="200" w:after="0"/>
-      </w:pPr>
-    </w:p>
-    <w:p>
-      <w:pPr>
-        <w:spacing w:before="200" w:after="0"/>
-      </w:pPr>
-    </w:p>
-    <w:p>
-      <w:pPr>
-        <w:spacing w:before="200" w:after="0"/>
-      </w:pPr>
-    </w:p>
-    <w:p>
-      <w:pPr>
-        <w:spacing w:before="200" w:after="0"/>
-      </w:pPr>
-    </w:p>
-    <w:p>
-      <w:pPr>
-        <w:spacing w:before="100" w:after="120"/>
-        <w:rPr>
-          <w:rFonts w:hint="default"/>
-          <w:lang w:val="en-US"/>
-        </w:rPr>
-      </w:pPr>
-      <w:r>
-        <w:rPr>
-          <w:rFonts w:ascii="Arial" w:hAnsi="Arial" w:eastAsia="Arial" w:cs="Arial"/>
-          <w:b/>
-          <w:bCs/>
-          <w:color w:val="1E3A5F"/>
-          <w:sz w:val="24"/>
-          <w:szCs w:val="24"/>
-        </w:rPr>
-        <w:t xml:space="preserve">Test Case </w:t>
-      </w:r>
-      <w:r>
-        <w:rPr>
-          <w:rFonts w:hint="default" w:cs="Arial"/>
-          <w:b/>
-          <w:bCs/>
-          <w:color w:val="1E3A5F"/>
-          <w:sz w:val="24"/>
-          <w:szCs w:val="24"/>
-          <w:lang w:val="en-US"/>
-        </w:rPr>
-        <w:t>6</w:t>
-      </w:r>
-      <w:r>
-        <w:rPr>
-          <w:rFonts w:ascii="Arial" w:hAnsi="Arial" w:eastAsia="Arial" w:cs="Arial"/>
-          <w:b/>
-          <w:bCs/>
-          <w:color w:val="1E3A5F"/>
-          <w:sz w:val="24"/>
-          <w:szCs w:val="24"/>
-        </w:rPr>
-        <w:t xml:space="preserve">  </w:t>
-      </w:r>
-      <w:r>
-        <w:rPr>
-          <w:rFonts w:ascii="Arial" w:hAnsi="Arial" w:eastAsia="Arial" w:cs="Arial"/>
-          <w:b/>
-          <w:bCs/>
-          <w:color w:val="2563EB"/>
-          <w:sz w:val="24"/>
-          <w:szCs w:val="24"/>
-        </w:rPr>
-        <w:t xml:space="preserve">POST </w:t>
-      </w:r>
-      <w:r>
-        <w:rPr>
-          <w:rFonts w:hint="default" w:ascii="Courier New" w:hAnsi="Courier New" w:eastAsia="Courier New" w:cs="Courier New"/>
-          <w:color w:val="1E3A5F"/>
-          <w:sz w:val="22"/>
-          <w:szCs w:val="22"/>
-          <w:lang w:val="en-US"/>
-        </w:rPr>
-        <w:t xml:space="preserve"> - Add Product To Cart</w:t>
-      </w:r>
-    </w:p>
-    <w:tbl>
-      <w:tblPr>
-        <w:tblStyle w:val="9"/>
-        <w:tblW w:w="10077" w:type="dxa"/>
-        <w:tblInd w:w="0" w:type="dxa"/>
-        <w:tblBorders>
-          <w:top w:val="single" w:color="auto" w:sz="4" w:space="0"/>
-          <w:left w:val="single" w:color="auto" w:sz="4" w:space="0"/>
-          <w:bottom w:val="single" w:color="auto" w:sz="4" w:space="0"/>
-          <w:right w:val="single" w:color="auto" w:sz="4" w:space="0"/>
-          <w:insideH w:val="single" w:color="auto" w:sz="4" w:space="0"/>
-          <w:insideV w:val="single" w:color="auto" w:sz="4" w:space="0"/>
-        </w:tblBorders>
-        <w:tblLayout w:type="autofit"/>
-        <w:tblCellMar>
-          <w:top w:w="0" w:type="dxa"/>
-          <w:left w:w="10" w:type="dxa"/>
-          <w:bottom w:w="0" w:type="dxa"/>
-          <w:right w:w="10" w:type="dxa"/>
-        </w:tblCellMar>
-      </w:tblPr>
-      <w:tblGrid>
-        <w:gridCol w:w="10077"/>
-      </w:tblGrid>
-      <w:tr>
-        <w:tblPrEx>
-          <w:tblBorders>
-            <w:top w:val="single" w:color="auto" w:sz="4" w:space="0"/>
-            <w:left w:val="single" w:color="auto" w:sz="4" w:space="0"/>
-            <w:bottom w:val="single" w:color="auto" w:sz="4" w:space="0"/>
-            <w:right w:val="single" w:color="auto" w:sz="4" w:space="0"/>
-            <w:insideH w:val="single" w:color="auto" w:sz="4" w:space="0"/>
-            <w:insideV w:val="single" w:color="auto" w:sz="4" w:space="0"/>
-          </w:tblBorders>
-          <w:tblCellMar>
-            <w:top w:w="0" w:type="dxa"/>
-            <w:left w:w="10" w:type="dxa"/>
-            <w:bottom w:w="0" w:type="dxa"/>
-            <w:right w:w="10" w:type="dxa"/>
-          </w:tblCellMar>
-        </w:tblPrEx>
-        <w:tc>
-          <w:tcPr>
-            <w:tcW w:w="10077" w:type="dxa"/>
-            <w:tcBorders>
-              <w:top w:val="single" w:color="CCCCCC" w:sz="0" w:space="0"/>
-              <w:left w:val="single" w:color="CCCCCC" w:sz="0" w:space="0"/>
-              <w:bottom w:val="single" w:color="CCCCCC" w:sz="0" w:space="0"/>
-              <w:right w:val="single" w:color="CCCCCC" w:sz="0" w:space="0"/>
-            </w:tcBorders>
-            <w:shd w:val="clear" w:color="auto" w:fill="F8FAFC"/>
-            <w:tcMar>
-              <w:top w:w="120" w:type="dxa"/>
-              <w:left w:w="200" w:type="dxa"/>
-              <w:bottom w:w="120" w:type="dxa"/>
-              <w:right w:w="200" w:type="dxa"/>
-            </w:tcMar>
-          </w:tcPr>
-          <w:p>
-            <w:pPr>
-              <w:spacing w:before="60" w:after="60"/>
-            </w:pPr>
-            <w:r>
-              <w:rPr>
-                <w:rFonts w:ascii="Arial" w:hAnsi="Arial" w:eastAsia="Arial" w:cs="Arial"/>
-                <w:b/>
-                <w:bCs/>
-                <w:color w:val="374151"/>
-                <w:sz w:val="20"/>
-                <w:szCs w:val="20"/>
-              </w:rPr>
-              <w:t xml:space="preserve">Method:        </w:t>
-            </w:r>
-            <w:r>
-              <w:rPr>
-                <w:rFonts w:ascii="Arial" w:hAnsi="Arial" w:eastAsia="Arial" w:cs="Arial"/>
-                <w:b/>
-                <w:bCs/>
-                <w:color w:val="2563EB"/>
-                <w:sz w:val="20"/>
-                <w:szCs w:val="20"/>
-              </w:rPr>
-              <w:t>POST</w:t>
-            </w:r>
-          </w:p>
-          <w:p>
-            <w:pPr>
-              <w:spacing w:before="60" w:after="60"/>
-            </w:pPr>
-            <w:r>
-              <w:rPr>
-                <w:rFonts w:ascii="Arial" w:hAnsi="Arial" w:eastAsia="Arial" w:cs="Arial"/>
-                <w:b/>
-                <w:bCs/>
-                <w:color w:val="374151"/>
-                <w:sz w:val="20"/>
-                <w:szCs w:val="20"/>
-              </w:rPr>
-              <w:t xml:space="preserve">URL:             </w:t>
-            </w:r>
-            <w:r>
-              <w:rPr>
-                <w:rStyle w:val="14"/>
-                <w:rFonts w:hint="default" w:ascii="Calibri" w:hAnsi="Calibri" w:eastAsia="SimSun" w:cs="Calibri"/>
-                <w:sz w:val="24"/>
-                <w:szCs w:val="24"/>
-              </w:rPr>
-              <w:t>http://localhost:3000/</w:t>
-            </w:r>
-            <w:r>
-              <w:rPr>
-                <w:rStyle w:val="14"/>
-                <w:rFonts w:hint="default" w:ascii="Calibri" w:hAnsi="Calibri" w:eastAsia="SimSun" w:cs="Calibri"/>
-                <w:sz w:val="24"/>
-                <w:szCs w:val="24"/>
-                <w:lang w:val="en-US"/>
-              </w:rPr>
-              <w:t>api/cart</w:t>
-            </w:r>
-          </w:p>
-          <w:p>
-            <w:pPr>
-              <w:spacing w:before="60" w:after="60"/>
-              <w:rPr>
-                <w:rFonts w:hint="default"/>
-                <w:lang w:val="en-US"/>
-              </w:rPr>
-            </w:pPr>
-            <w:r>
-              <w:rPr>
-                <w:rFonts w:ascii="Arial" w:hAnsi="Arial" w:eastAsia="Arial" w:cs="Arial"/>
-                <w:b/>
-                <w:bCs/>
-                <w:color w:val="374151"/>
-                <w:sz w:val="20"/>
-                <w:szCs w:val="20"/>
-              </w:rPr>
-              <w:t xml:space="preserve">Status:          </w:t>
-            </w:r>
-            <w:r>
-              <w:rPr>
-                <w:rFonts w:ascii="Arial" w:hAnsi="Arial" w:eastAsia="Arial" w:cs="Arial"/>
-                <w:b/>
-                <w:bCs/>
-                <w:color w:val="16A34A"/>
-                <w:sz w:val="20"/>
-                <w:szCs w:val="20"/>
-              </w:rPr>
-              <w:t>20</w:t>
-            </w:r>
-            <w:r>
-              <w:rPr>
-                <w:rFonts w:hint="default" w:cs="Arial"/>
-                <w:b/>
-                <w:bCs/>
-                <w:color w:val="16A34A"/>
-                <w:sz w:val="20"/>
-                <w:szCs w:val="20"/>
-                <w:lang w:val="en-US"/>
-              </w:rPr>
-              <w:t>0 OK</w:t>
-            </w:r>
-          </w:p>
-          <w:p>
-            <w:pPr>
-              <w:spacing w:before="60" w:after="40"/>
-              <w:rPr>
-                <w:rFonts w:hint="default"/>
-                <w:lang w:val="en-US"/>
-              </w:rPr>
-            </w:pPr>
-            <w:r>
-              <w:rPr>
-                <w:rFonts w:ascii="Arial" w:hAnsi="Arial" w:eastAsia="Arial" w:cs="Arial"/>
-                <w:b/>
-                <w:bCs/>
-                <w:color w:val="374151"/>
-                <w:sz w:val="20"/>
-                <w:szCs w:val="20"/>
-              </w:rPr>
-              <w:t>Request Body:</w:t>
-            </w:r>
-          </w:p>
-          <w:p>
-            <w:pPr>
-              <w:spacing w:before="20" w:after="20"/>
-            </w:pPr>
-            <w:r>
-              <w:rPr>
-                <w:rFonts w:hint="default" w:ascii="Calibri" w:hAnsi="Calibri" w:cs="Calibri"/>
-              </w:rPr>
-              <w:t>{</w:t>
-            </w:r>
-            <w:r>
-              <w:rPr>
-                <w:rFonts w:hint="default" w:ascii="Calibri" w:hAnsi="Calibri" w:cs="Calibri"/>
-              </w:rPr>
-              <w:br w:type="textWrapping"/>
-            </w:r>
-            <w:r>
-              <w:rPr>
-                <w:rFonts w:hint="default" w:ascii="Calibri" w:hAnsi="Calibri" w:cs="Calibri"/>
-              </w:rPr>
-              <w:t>"productId":"</w:t>
-            </w:r>
-            <w:r>
-              <w:rPr>
-                <w:rFonts w:hint="default" w:ascii="Calibri" w:hAnsi="Calibri" w:eastAsia="monospace" w:cs="Calibri"/>
-                <w:i w:val="0"/>
-                <w:iCs w:val="0"/>
-                <w:caps w:val="0"/>
-                <w:color w:val="auto"/>
-                <w:spacing w:val="0"/>
-                <w:sz w:val="14"/>
-                <w:szCs w:val="14"/>
-                <w:shd w:val="clear" w:fill="E8EDEB"/>
-              </w:rPr>
-              <w:t>6a29d6ee14f2361a27268899</w:t>
-            </w:r>
-            <w:r>
-              <w:rPr>
-                <w:rFonts w:hint="default" w:ascii="Calibri" w:hAnsi="Calibri" w:cs="Calibri"/>
-              </w:rPr>
-              <w:t>",</w:t>
-            </w:r>
-            <w:r>
-              <w:rPr>
-                <w:rFonts w:hint="default" w:ascii="Calibri" w:hAnsi="Calibri" w:cs="Calibri"/>
-              </w:rPr>
-              <w:br w:type="textWrapping"/>
-            </w:r>
-            <w:r>
-              <w:rPr>
-                <w:rFonts w:hint="default" w:ascii="Calibri" w:hAnsi="Calibri" w:cs="Calibri"/>
-              </w:rPr>
-              <w:t>"quantity":2</w:t>
-            </w:r>
-            <w:r>
-              <w:rPr>
-                <w:rFonts w:hint="default" w:ascii="Calibri" w:hAnsi="Calibri" w:cs="Calibri"/>
-              </w:rPr>
-              <w:br w:type="textWrapping"/>
-            </w:r>
-            <w:r>
-              <w:rPr>
-                <w:rFonts w:hint="default" w:ascii="Calibri" w:hAnsi="Calibri" w:cs="Calibri"/>
-              </w:rPr>
-              <w:t>}</w:t>
-            </w:r>
-            <w:r>
-              <w:rPr>
-                <w:rFonts w:hint="default" w:ascii="Calibri" w:hAnsi="Calibri" w:cs="Calibri"/>
-              </w:rPr>
-              <w:br w:type="textWrapping"/>
-            </w:r>
-          </w:p>
-          <w:p>
-            <w:pPr>
-              <w:spacing w:before="80" w:after="40"/>
-            </w:pPr>
-            <w:r>
-              <w:rPr>
-                <w:rFonts w:ascii="Arial" w:hAnsi="Arial" w:eastAsia="Arial" w:cs="Arial"/>
-                <w:b/>
-                <w:bCs/>
-                <w:color w:val="374151"/>
-                <w:sz w:val="20"/>
-                <w:szCs w:val="20"/>
-              </w:rPr>
-              <w:t>Description:</w:t>
-            </w:r>
-          </w:p>
-          <w:p>
-            <w:pPr>
-              <w:spacing w:before="40" w:after="60"/>
-            </w:pPr>
-            <w:r>
-              <w:rPr>
-                <w:rFonts w:hint="default" w:ascii="Calibri" w:hAnsi="Calibri" w:cs="Calibri"/>
-              </w:rPr>
-              <w:t>Add product into shopping cart.</w:t>
-            </w:r>
-          </w:p>
-        </w:tc>
-      </w:tr>
-    </w:tbl>
-    <w:p>
-      <w:pPr>
-        <w:spacing w:before="120" w:after="0"/>
-      </w:pPr>
-    </w:p>
-    <w:p>
-      <w:pPr>
-        <w:spacing w:before="120" w:after="0"/>
-      </w:pPr>
-      <w:r>
-        <w:rPr>
-          <w:sz w:val="20"/>
-        </w:rPr>
-        <mc:AlternateContent>
-          <mc:Choice Requires="wps">
-            <w:drawing>
-              <wp:anchor distT="0" distB="0" distL="114300" distR="114300" simplePos="0" relativeHeight="251662336" behindDoc="0" locked="0" layoutInCell="1" allowOverlap="1">
-                <wp:simplePos x="0" y="0"/>
-                <wp:positionH relativeFrom="column">
-                  <wp:posOffset>-131445</wp:posOffset>
-                </wp:positionH>
-                <wp:positionV relativeFrom="paragraph">
-                  <wp:posOffset>65405</wp:posOffset>
-                </wp:positionV>
-                <wp:extent cx="6402070" cy="3660140"/>
-                <wp:effectExtent l="4445" t="4445" r="9525" b="8255"/>
-                <wp:wrapNone/>
-                <wp:docPr id="10" name="Text Box 10"/>
-                <wp:cNvGraphicFramePr/>
-                <a:graphic xmlns:a="http://schemas.openxmlformats.org/drawingml/2006/main">
-                  <a:graphicData uri="http://schemas.microsoft.com/office/word/2010/wordprocessingShape">
-                    <wps:wsp>
-                      <wps:cNvSpPr txBox="1"/>
-                      <wps:spPr>
-                        <a:xfrm>
-                          <a:off x="0" y="0"/>
-                          <a:ext cx="6402070" cy="3660140"/>
-                        </a:xfrm>
-                        <a:prstGeom prst="rect">
-                          <a:avLst/>
-                        </a:prstGeom>
-                        <a:solidFill>
-                          <a:srgbClr val="F4F9F5"/>
-                        </a:solidFill>
-                        <a:ln w="9525">
-                          <a:solidFill>
-                            <a:schemeClr val="tx1"/>
-                          </a:solidFill>
-                          <a:prstDash val="dash"/>
-                        </a:ln>
-                      </wps:spPr>
-                      <wps:style>
-                        <a:lnRef idx="0">
-                          <a:schemeClr val="accent1"/>
-                        </a:lnRef>
-                        <a:fillRef idx="0">
-                          <a:schemeClr val="accent1"/>
-                        </a:fillRef>
-                        <a:effectRef idx="0">
-                          <a:schemeClr val="accent1"/>
-                        </a:effectRef>
-                        <a:fontRef idx="minor">
-                          <a:schemeClr val="dk1"/>
-                        </a:fontRef>
-                      </wps:style>
-                      <wps:txbx>
-                        <w:txbxContent>
-                          <w:p>
-                            <w:pPr>
-                              <w:rPr>
-                                <w:rFonts w:hint="default"/>
-                                <w:sz w:val="10"/>
-                                <w:szCs w:val="10"/>
-                                <w:lang w:val="en-US"/>
-                                <w14:textOutline w14:w="9525">
-                                  <w14:solidFill>
-                                    <w14:srgbClr w14:val="000000"/>
-                                  </w14:solidFill>
-                                  <w14:prstDash w14:val="sysDash"/>
-                                  <w14:round/>
-                                </w14:textOutline>
-                              </w:rPr>
-                            </w:pPr>
-                          </w:p>
-                          <w:p>
-                            <w:pPr>
-                              <w:rPr>
-                                <w:rFonts w:hint="default"/>
-                                <w:lang w:val="en-IN"/>
-                                <w14:textOutline w14:w="9525">
-                                  <w14:solidFill>
-                                    <w14:srgbClr w14:val="000000"/>
-                                  </w14:solidFill>
-                                  <w14:prstDash w14:val="sysDash"/>
-                                  <w14:round/>
-                                </w14:textOutline>
-                              </w:rPr>
-                            </w:pPr>
-                            <w:r>
-                              <w:rPr>
-                                <w:rFonts w:hint="default"/>
-                                <w:lang w:val="en-IN"/>
-                                <w14:textOutline w14:w="9525">
-                                  <w14:solidFill>
-                                    <w14:srgbClr w14:val="000000"/>
-                                  </w14:solidFill>
-                                  <w14:prstDash w14:val="sysDash"/>
-                                  <w14:round/>
-                                </w14:textOutline>
-                              </w:rPr>
-                              <w:drawing>
-                                <wp:inline distT="0" distB="0" distL="114300" distR="114300">
-                                  <wp:extent cx="6203315" cy="3328035"/>
-                                  <wp:effectExtent l="0" t="0" r="14605" b="9525"/>
-                                  <wp:docPr id="5" name="Picture 5" descr="test6"/>
-                                  <wp:cNvGraphicFramePr>
-                                    <a:graphicFrameLocks xmlns:a="http://schemas.openxmlformats.org/drawingml/2006/main" noChangeAspect="1"/>
-                                  </wp:cNvGraphicFramePr>
-                                  <a:graphic xmlns:a="http://schemas.openxmlformats.org/drawingml/2006/main">
-                                    <a:graphicData uri="http://schemas.openxmlformats.org/drawingml/2006/picture">
-                                      <pic:pic xmlns:pic="http://schemas.openxmlformats.org/drawingml/2006/picture">
-                                        <pic:nvPicPr>
-                                          <pic:cNvPr id="5" name="Picture 5" descr="test6"/>
-                                          <pic:cNvPicPr>
-                                            <a:picLocks noChangeAspect="1"/>
-                                          </pic:cNvPicPr>
-                                        </pic:nvPicPr>
-                                        <pic:blipFill>
-                                          <a:blip r:embed="rId12"/>
-                                          <a:stretch>
-                                            <a:fillRect/>
-                                          </a:stretch>
-                                        </pic:blipFill>
-                                        <pic:spPr>
-                                          <a:xfrm>
-                                            <a:off x="0" y="0"/>
-                                            <a:ext cx="6203315" cy="3328035"/>
-                                          </a:xfrm>
-                                          <a:prstGeom prst="rect">
-                                            <a:avLst/>
-                                          </a:prstGeom>
-                                        </pic:spPr>
-                                      </pic:pic>
-                                    </a:graphicData>
-                                  </a:graphic>
-                                </wp:inline>
-                              </w:drawing>
-                            </w:r>
-                          </w:p>
-                        </w:txbxContent>
-                      </wps:txbx>
-                      <wps:bodyPr rot="0" spcFirstLastPara="0" vertOverflow="overflow" horzOverflow="overflow" vert="horz" wrap="square" lIns="91440" tIns="45720" rIns="91440" bIns="45720" numCol="1" spcCol="0" rtlCol="0" fromWordArt="0" anchor="t" anchorCtr="0" forceAA="0" compatLnSpc="1">
-                        <a:noAutofit/>
-                      </wps:bodyPr>
-                    </wps:wsp>
-                  </a:graphicData>
-                </a:graphic>
-              </wp:anchor>
-            </w:drawing>
-          </mc:Choice>
-          <mc:Fallback>
-            <w:pict>
-              <v:shape id="_x0000_s1026" o:spid="_x0000_s1026" o:spt="202" type="#_x0000_t202" style="position:absolute;left:0pt;margin-left:-10.35pt;margin-top:5.15pt;height:288.2pt;width:504.1pt;z-index:251662336;mso-width-relative:page;mso-height-relative:page;" fillcolor="#F4F9F5" filled="t" stroked="t" coordsize="21600,21600" o:gfxdata="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">
-                <v:fill on="t" focussize="0,0"/>
-                <v:stroke color="#000000 [3213]" joinstyle="round" dashstyle="dash"/>
-                <v:imagedata o:title=""/>
-                <o:lock v:ext="edit" aspectratio="f"/>
-                <v:textbox>
-                  <w:txbxContent>
-                    <w:p>
-                      <w:pPr>
-                        <w:rPr>
-                          <w:rFonts w:hint="default"/>
-                          <w:sz w:val="10"/>
-                          <w:szCs w:val="10"/>
-                          <w:lang w:val="en-US"/>
-                          <w14:textOutline w14:w="9525">
-                            <w14:solidFill>
-                              <w14:srgbClr w14:val="000000"/>
-                            </w14:solidFill>
-                            <w14:prstDash w14:val="sysDash"/>
-                            <w14:round/>
-                          </w14:textOutline>
-                        </w:rPr>
-                      </w:pPr>
-                    </w:p>
-                    <w:p>
-                      <w:pPr>
-                        <w:rPr>
-                          <w:rFonts w:hint="default"/>
-                          <w:lang w:val="en-IN"/>
-                          <w14:textOutline w14:w="9525">
-                            <w14:solidFill>
-                              <w14:srgbClr w14:val="000000"/>
-                            </w14:solidFill>
-                            <w14:prstDash w14:val="sysDash"/>
-                            <w14:round/>
-                          </w14:textOutline>
-                        </w:rPr>
-                      </w:pPr>
-                      <w:r>
-                        <w:rPr>
-                          <w:rFonts w:hint="default"/>
-                          <w:lang w:val="en-IN"/>
-                          <w14:textOutline w14:w="9525">
-                            <w14:solidFill>
-                              <w14:srgbClr w14:val="000000"/>
-                            </w14:solidFill>
-                            <w14:prstDash w14:val="sysDash"/>
-                            <w14:round/>
-                          </w14:textOutline>
-                        </w:rPr>
-                        <w:drawing>
-                          <wp:inline distT="0" distB="0" distL="114300" distR="114300">
-                            <wp:extent cx="6203315" cy="3328035"/>
-                            <wp:effectExtent l="0" t="0" r="14605" b="9525"/>
-                            <wp:docPr id="5" name="Picture 5" descr="test6"/>
-                            <wp:cNvGraphicFramePr>
-                              <a:graphicFrameLocks xmlns:a="http://schemas.openxmlformats.org/drawingml/2006/main" noChangeAspect="1"/>
-                            </wp:cNvGraphicFramePr>
-                            <a:graphic xmlns:a="http://schemas.openxmlformats.org/drawingml/2006/main">
-                              <a:graphicData uri="http://schemas.openxmlformats.org/drawingml/2006/picture">
-                                <pic:pic xmlns:pic="http://schemas.openxmlformats.org/drawingml/2006/picture">
-                                  <pic:nvPicPr>
-                                    <pic:cNvPr id="5" name="Picture 5" descr="test6"/>
+                                    <pic:cNvPr id="21" name="Picture 21" descr="test6"/>
                                     <pic:cNvPicPr>
                                       <a:picLocks noChangeAspect="1"/>
                                     </pic:cNvPicPr>
@@ -5396,87 +5735,82 @@
     </w:p>
     <w:p>
       <w:pPr>
-        <w:spacing w:before="120" w:after="0"/>
-      </w:pPr>
-    </w:p>
-    <w:p>
-      <w:pPr>
-        <w:spacing w:before="120" w:after="0"/>
-      </w:pPr>
-    </w:p>
-    <w:p>
-      <w:pPr>
-        <w:spacing w:before="120" w:after="0"/>
-      </w:pPr>
-    </w:p>
-    <w:p>
-      <w:pPr>
-        <w:spacing w:before="120" w:after="0"/>
-      </w:pPr>
-    </w:p>
-    <w:p>
-      <w:pPr>
-        <w:spacing w:before="120" w:after="0"/>
-      </w:pPr>
-    </w:p>
-    <w:p>
-      <w:pPr>
-        <w:spacing w:before="120" w:after="0"/>
-      </w:pPr>
-    </w:p>
-    <w:p>
-      <w:pPr>
-        <w:spacing w:before="120" w:after="0"/>
-      </w:pPr>
-    </w:p>
-    <w:p>
-      <w:pPr>
-        <w:spacing w:before="120" w:after="0"/>
-      </w:pPr>
-    </w:p>
-    <w:p>
-      <w:pPr>
-        <w:spacing w:before="120" w:after="0"/>
-      </w:pPr>
-    </w:p>
-    <w:p>
-      <w:pPr>
-        <w:spacing w:before="120" w:after="0"/>
-      </w:pPr>
-    </w:p>
-    <w:p>
-      <w:pPr>
-        <w:spacing w:before="120" w:after="0"/>
-      </w:pPr>
-    </w:p>
-    <w:p>
-      <w:pPr>
-        <w:spacing w:before="120" w:after="0"/>
-      </w:pPr>
-    </w:p>
-    <w:p>
-      <w:pPr>
-        <w:spacing w:before="120" w:after="0"/>
-      </w:pPr>
-    </w:p>
-    <w:p>
-      <w:pPr>
-        <w:spacing w:before="120" w:after="0"/>
-      </w:pPr>
-    </w:p>
-    <w:p>
-      <w:pPr>
-        <w:spacing w:before="120" w:after="0"/>
-      </w:pPr>
-    </w:p>
-    <w:p>
-      <w:pPr>
-        <w:spacing w:before="120" w:after="0"/>
-      </w:pPr>
-    </w:p>
-    <w:p>
-      <w:pPr>
-        <w:spacing w:before="120" w:after="0"/>
+        <w:spacing w:before="200" w:after="0"/>
+      </w:pPr>
+    </w:p>
+    <w:p>
+      <w:pPr>
+        <w:spacing w:before="200" w:after="0"/>
+      </w:pPr>
+    </w:p>
+    <w:p>
+      <w:pPr>
+        <w:spacing w:before="200" w:after="0"/>
+      </w:pPr>
+    </w:p>
+    <w:p>
+      <w:pPr>
+        <w:spacing w:before="200" w:after="0"/>
+      </w:pPr>
+    </w:p>
+    <w:p>
+      <w:pPr>
+        <w:spacing w:before="200" w:after="0"/>
+      </w:pPr>
+    </w:p>
+    <w:p>
+      <w:pPr>
+        <w:spacing w:before="200" w:after="0"/>
+      </w:pPr>
+    </w:p>
+    <w:p>
+      <w:pPr>
+        <w:spacing w:before="200" w:after="0"/>
+      </w:pPr>
+    </w:p>
+    <w:p>
+      <w:pPr>
+        <w:spacing w:before="200" w:after="0"/>
+      </w:pPr>
+    </w:p>
+    <w:p>
+      <w:pPr>
+        <w:spacing w:before="200" w:after="0"/>
+      </w:pPr>
+    </w:p>
+    <w:p>
+      <w:pPr>
+        <w:spacing w:before="200" w:after="0"/>
+      </w:pPr>
+    </w:p>
+    <w:p>
+      <w:pPr>
+        <w:spacing w:before="200" w:after="0"/>
+      </w:pPr>
+    </w:p>
+    <w:p>
+      <w:pPr>
+        <w:spacing w:before="200" w:after="0"/>
+      </w:pPr>
+    </w:p>
+    <w:p>
+      <w:pPr>
+        <w:spacing w:before="200" w:after="0"/>
+      </w:pPr>
+    </w:p>
+    <w:p>
+      <w:pPr>
+        <w:spacing w:before="200" w:after="0"/>
+      </w:pPr>
+    </w:p>
+    <w:p>
+      <w:pPr>
+        <w:spacing w:before="200" w:after="0"/>
+      </w:pPr>
+    </w:p>
+    <w:p>
+      <w:pPr>
+        <w:spacing w:before="200" w:after="0"/>
       </w:pPr>
     </w:p>
     <w:p>
@@ -5717,12 +6051,21 @@
                 <w:szCs w:val="24"/>
                 <w:lang w:val="en-US"/>
               </w:rPr>
-              <w:t>api/cart/6a29d6ee14f2361a27268899</w:t>
+              <w:t>api/cart/6a303b0f2b344bd8b4b2e641</w:t>
             </w:r>
           </w:p>
           <w:p>
             <w:pPr>
               <w:spacing w:before="60" w:after="60"/>
+              <w:rPr>
+                <w:rFonts w:hint="default" w:cs="Arial"/>
+                <w:b/>
+                <w:bCs/>
+                <w:color w:val="16A34A"/>
+                <w:sz w:val="20"/>
+                <w:szCs w:val="20"/>
+                <w:lang w:val="en-US"/>
+              </w:rPr>
             </w:pPr>
             <w:r>
               <w:rPr>
@@ -5757,6 +6100,67 @@
                 <w:lang w:val="en-US"/>
               </w:rPr>
               <w:t>0 OK</w:t>
+            </w:r>
+          </w:p>
+          <w:p>
+            <w:pPr>
+              <w:spacing w:before="60" w:after="40"/>
+              <w:rPr>
+                <w:rFonts w:hint="default" w:cs="Arial"/>
+                <w:b/>
+                <w:bCs/>
+                <w:color w:val="16A34A"/>
+                <w:sz w:val="20"/>
+                <w:szCs w:val="20"/>
+                <w:lang w:val="en-US"/>
+              </w:rPr>
+            </w:pPr>
+            <w:r>
+              <w:rPr>
+                <w:rFonts w:hint="default" w:cs="Arial"/>
+                <w:b/>
+                <w:bCs/>
+                <w:color w:val="374151"/>
+                <w:sz w:val="20"/>
+                <w:szCs w:val="20"/>
+                <w:lang w:val="en-IN"/>
+              </w:rPr>
+              <w:t>Authorization</w:t>
+            </w:r>
+            <w:r>
+              <w:rPr>
+                <w:rFonts w:ascii="Arial" w:hAnsi="Arial" w:eastAsia="Arial" w:cs="Arial"/>
+                <w:b/>
+                <w:bCs/>
+                <w:color w:val="374151"/>
+                <w:sz w:val="20"/>
+                <w:szCs w:val="20"/>
+              </w:rPr>
+              <w:t>:</w:t>
+            </w:r>
+            <w:r>
+              <w:rPr>
+                <w:rFonts w:hint="default" w:cs="Arial"/>
+                <w:b/>
+                <w:bCs/>
+                <w:color w:val="374151"/>
+                <w:sz w:val="20"/>
+                <w:szCs w:val="20"/>
+                <w:lang w:val="en-IN"/>
+              </w:rPr>
+              <w:t xml:space="preserve"> </w:t>
+            </w:r>
+            <w:r>
+              <w:rPr>
+                <w:rFonts w:hint="default" w:cs="Arial"/>
+                <w:b w:val="0"/>
+                <w:bCs w:val="0"/>
+                <w:color w:val="374151"/>
+                <w:sz w:val="18"/>
+                <w:szCs w:val="18"/>
+                <w:lang w:val="en-IN"/>
+              </w:rPr>
+              <w:t>Bearer &lt;JWT TOKEN&gt;</w:t>
             </w:r>
           </w:p>
           <w:p>
@@ -5866,7 +6270,7 @@
         <mc:AlternateContent>
           <mc:Choice Requires="wps">
             <w:drawing>
-              <wp:anchor distT="0" distB="0" distL="114300" distR="114300" simplePos="0" relativeHeight="251663360" behindDoc="0" locked="0" layoutInCell="1" allowOverlap="1">
+              <wp:anchor distT="0" distB="0" distL="114300" distR="114300" simplePos="0" relativeHeight="251662336" behindDoc="0" locked="0" layoutInCell="1" allowOverlap="1">
                 <wp:simplePos x="0" y="0"/>
                 <wp:positionH relativeFrom="column">
                   <wp:posOffset>-131445</wp:posOffset>
@@ -5964,7 +6368,7 @@
                                 <wp:inline distT="0" distB="0" distL="114300" distR="114300">
                                   <wp:extent cx="6203315" cy="3328035"/>
                                   <wp:effectExtent l="0" t="0" r="14605" b="9525"/>
-                                  <wp:docPr id="14" name="Picture 14" descr="test7"/>
+                                  <wp:docPr id="22" name="Picture 22" descr="test7"/>
                                   <wp:cNvGraphicFramePr>
                                     <a:graphicFrameLocks xmlns:a="http://schemas.openxmlformats.org/drawingml/2006/main" noChangeAspect="1"/>
                                   </wp:cNvGraphicFramePr>
@@ -5972,7 +6376,7 @@
                                     <a:graphicData uri="http://schemas.openxmlformats.org/drawingml/2006/picture">
                                       <pic:pic xmlns:pic="http://schemas.openxmlformats.org/drawingml/2006/picture">
                                         <pic:nvPicPr>
-                                          <pic:cNvPr id="14" name="Picture 14" descr="test7"/>
+                                          <pic:cNvPr id="22" name="Picture 22" descr="test7"/>
                                           <pic:cNvPicPr>
                                             <a:picLocks noChangeAspect="1"/>
                                           </pic:cNvPicPr>
@@ -6012,7 +6416,7 @@
           </mc:Choice>
           <mc:Fallback>
             <w:pict>
-              <v:shape id="_x0000_s1026" o:spid="_x0000_s1026" o:spt="202" type="#_x0000_t202" style="position:absolute;left:0pt;margin-left:-10.35pt;margin-top:5.55pt;height:288.2pt;width:504.1pt;z-index:251663360;mso-width-relative:page;mso-height-relative:page;" fillcolor="#F4F9F5" filled="t" stroked="t" coordsize="21600,21600" o:gfxdata="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">
+              <v:shape id="_x0000_s1026" o:spid="_x0000_s1026" o:spt="202" type="#_x0000_t202" style="position:absolute;left:0pt;margin-left:-10.35pt;margin-top:5.55pt;height:288.2pt;width:504.1pt;z-index:251662336;mso-width-relative:page;mso-height-relative:page;" fillcolor="#F4F9F5" filled="t" stroked="t" coordsize="21600,21600" o:gfxdata="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">
                 <v:fill on="t" focussize="0,0"/>
                 <v:stroke color="#000000 [3213]" joinstyle="round" dashstyle="dash"/>
                 <v:imagedata o:title=""/>
@@ -6066,7 +6470,7 @@
                           <wp:inline distT="0" distB="0" distL="114300" distR="114300">
                             <wp:extent cx="6203315" cy="3328035"/>
                             <wp:effectExtent l="0" t="0" r="14605" b="9525"/>
-                            <wp:docPr id="14" name="Picture 14" descr="test7"/>
+                            <wp:docPr id="22" name="Picture 22" descr="test7"/>
                             <wp:cNvGraphicFramePr>
                               <a:graphicFrameLocks xmlns:a="http://schemas.openxmlformats.org/drawingml/2006/main" noChangeAspect="1"/>
                             </wp:cNvGraphicFramePr>
@@ -6074,7 +6478,7 @@
                               <a:graphicData uri="http://schemas.openxmlformats.org/drawingml/2006/picture">
                                 <pic:pic xmlns:pic="http://schemas.openxmlformats.org/drawingml/2006/picture">
                                   <pic:nvPicPr>
-                                    <pic:cNvPr id="14" name="Picture 14" descr="test7"/>
+                                    <pic:cNvPr id="22" name="Picture 22" descr="test7"/>
                                     <pic:cNvPicPr>
                                       <a:picLocks noChangeAspect="1"/>
                                     </pic:cNvPicPr>
@@ -6441,12 +6845,34 @@
                 <w:szCs w:val="24"/>
                 <w:lang w:val="en-US"/>
               </w:rPr>
-              <w:t>api/cart/6a29d6ee14f2361a27268899</w:t>
+              <w:t>api/cart/</w:t>
+            </w:r>
+            <w:r>
+              <w:rPr>
+                <w:rFonts w:hint="default" w:ascii="Calibri" w:hAnsi="Calibri" w:eastAsia="monospace" w:cs="Calibri"/>
+                <w:i w:val="0"/>
+                <w:iCs w:val="0"/>
+                <w:caps w:val="0"/>
+                <w:color w:val="auto"/>
+                <w:spacing w:val="0"/>
+                <w:sz w:val="20"/>
+                <w:szCs w:val="20"/>
+                <w:shd w:val="clear" w:fill="E8EDEB"/>
+              </w:rPr>
+              <w:t>6a303b0f2b344bd8b4b2e641</w:t>
             </w:r>
           </w:p>
           <w:p>
             <w:pPr>
               <w:spacing w:before="60" w:after="60"/>
+              <w:rPr>
+                <w:rFonts w:ascii="Arial" w:hAnsi="Arial" w:eastAsia="Arial" w:cs="Arial"/>
+                <w:b/>
+                <w:bCs/>
+                <w:color w:val="16A34A"/>
+                <w:sz w:val="20"/>
+                <w:szCs w:val="20"/>
+              </w:rPr>
             </w:pPr>
             <w:r>
               <w:rPr>
@@ -6469,6 +6895,66 @@
                 <w:szCs w:val="20"/>
               </w:rPr>
               <w:t>200 OK</w:t>
+            </w:r>
+          </w:p>
+          <w:p>
+            <w:pPr>
+              <w:spacing w:before="60" w:after="40"/>
+              <w:rPr>
+                <w:rFonts w:ascii="Arial" w:hAnsi="Arial" w:eastAsia="Arial" w:cs="Arial"/>
+                <w:b/>
+                <w:bCs/>
+                <w:color w:val="16A34A"/>
+                <w:sz w:val="20"/>
+                <w:szCs w:val="20"/>
+              </w:rPr>
+            </w:pPr>
+            <w:r>
+              <w:rPr>
+                <w:rFonts w:hint="default" w:cs="Arial"/>
+                <w:b/>
+                <w:bCs/>
+                <w:color w:val="374151"/>
+                <w:sz w:val="20"/>
+                <w:szCs w:val="20"/>
+                <w:lang w:val="en-IN"/>
+              </w:rPr>
+              <w:t>Authorization</w:t>
+            </w:r>
+            <w:r>
+              <w:rPr>
+                <w:rFonts w:ascii="Arial" w:hAnsi="Arial" w:eastAsia="Arial" w:cs="Arial"/>
+                <w:b/>
+                <w:bCs/>
+                <w:color w:val="374151"/>
+                <w:sz w:val="20"/>
+                <w:szCs w:val="20"/>
+              </w:rPr>
+              <w:t>:</w:t>
+            </w:r>
+            <w:r>
+              <w:rPr>
+                <w:rFonts w:hint="default" w:cs="Arial"/>
+                <w:b/>
+                <w:bCs/>
+                <w:color w:val="374151"/>
+                <w:sz w:val="20"/>
+                <w:szCs w:val="20"/>
+                <w:lang w:val="en-IN"/>
+              </w:rPr>
+              <w:t xml:space="preserve"> </w:t>
+            </w:r>
+            <w:r>
+              <w:rPr>
+                <w:rFonts w:hint="default" w:cs="Arial"/>
+                <w:b w:val="0"/>
+                <w:bCs w:val="0"/>
+                <w:color w:val="374151"/>
+                <w:sz w:val="18"/>
+                <w:szCs w:val="18"/>
+                <w:lang w:val="en-IN"/>
+              </w:rPr>
+              <w:t>Bearer &lt;JWT TOKEN&gt;</w:t>
             </w:r>
           </w:p>
           <w:p>
@@ -6512,7 +6998,7 @@
         <mc:AlternateContent>
           <mc:Choice Requires="wps">
             <w:drawing>
-              <wp:anchor distT="0" distB="0" distL="114300" distR="114300" simplePos="0" relativeHeight="251664384" behindDoc="0" locked="0" layoutInCell="1" allowOverlap="1">
+              <wp:anchor distT="0" distB="0" distL="114300" distR="114300" simplePos="0" relativeHeight="251663360" behindDoc="0" locked="0" layoutInCell="1" allowOverlap="1">
                 <wp:simplePos x="0" y="0"/>
                 <wp:positionH relativeFrom="column">
                   <wp:posOffset>-131445</wp:posOffset>
@@ -6610,7 +7096,7 @@
                                 <wp:inline distT="0" distB="0" distL="114300" distR="114300">
                                   <wp:extent cx="6203315" cy="3328035"/>
                                   <wp:effectExtent l="0" t="0" r="14605" b="9525"/>
-                                  <wp:docPr id="15" name="Picture 15" descr="test8"/>
+                                  <wp:docPr id="23" name="Picture 23" descr="test8"/>
                                   <wp:cNvGraphicFramePr>
                                     <a:graphicFrameLocks xmlns:a="http://schemas.openxmlformats.org/drawingml/2006/main" noChangeAspect="1"/>
                                   </wp:cNvGraphicFramePr>
@@ -6618,7 +7104,7 @@
                                     <a:graphicData uri="http://schemas.openxmlformats.org/drawingml/2006/picture">
                                       <pic:pic xmlns:pic="http://schemas.openxmlformats.org/drawingml/2006/picture">
                                         <pic:nvPicPr>
-                                          <pic:cNvPr id="15" name="Picture 15" descr="test8"/>
+                                          <pic:cNvPr id="23" name="Picture 23" descr="test8"/>
                                           <pic:cNvPicPr>
                                             <a:picLocks noChangeAspect="1"/>
                                           </pic:cNvPicPr>
@@ -6658,7 +7144,7 @@
           </mc:Choice>
           <mc:Fallback>
             <w:pict>
-              <v:shape id="_x0000_s1026" o:spid="_x0000_s1026" o:spt="202" type="#_x0000_t202" style="position:absolute;left:0pt;margin-left:-10.35pt;margin-top:14.25pt;height:288.2pt;width:504.1pt;z-index:251664384;mso-width-relative:page;mso-height-relative:page;" fillcolor="#F4F9F5" filled="t" stroked="t" coordsize="21600,21600" o:gfxdata="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">
+              <v:shape id="_x0000_s1026" o:spid="_x0000_s1026" o:spt="202" type="#_x0000_t202" style="position:absolute;left:0pt;margin-left:-10.35pt;margin-top:14.25pt;height:288.2pt;width:504.1pt;z-index:251663360;mso-width-relative:page;mso-height-relative:page;" fillcolor="#F4F9F5" filled="t" stroked="t" coordsize="21600,21600" o:gfxdata="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">
                 <v:fill on="t" focussize="0,0"/>
                 <v:stroke color="#000000 [3213]" joinstyle="round" dashstyle="dash"/>
                 <v:imagedata o:title=""/>
@@ -6712,7 +7198,7 @@
                           <wp:inline distT="0" distB="0" distL="114300" distR="114300">
                             <wp:extent cx="6203315" cy="3328035"/>
                             <wp:effectExtent l="0" t="0" r="14605" b="9525"/>
-                            <wp:docPr id="15" name="Picture 15" descr="test8"/>
+                            <wp:docPr id="23" name="Picture 23" descr="test8"/>
                             <wp:cNvGraphicFramePr>
                               <a:graphicFrameLocks xmlns:a="http://schemas.openxmlformats.org/drawingml/2006/main" noChangeAspect="1"/>
                             </wp:cNvGraphicFramePr>
@@ -6720,7 +7206,7 @@
                               <a:graphicData uri="http://schemas.openxmlformats.org/drawingml/2006/picture">
                                 <pic:pic xmlns:pic="http://schemas.openxmlformats.org/drawingml/2006/picture">
                                   <pic:nvPicPr>
-                                    <pic:cNvPr id="15" name="Picture 15" descr="test8"/>
+                                    <pic:cNvPr id="23" name="Picture 23" descr="test8"/>
                                     <pic:cNvPicPr>
                                       <a:picLocks noChangeAspect="1"/>
                                     </pic:cNvPicPr>
@@ -7104,7 +7590,7 @@
             </w:r>
             <w:r>
               <w:rPr>
-                <w:rStyle w:val="15"/>
+                <w:rStyle w:val="16"/>
                 <w:rFonts w:hint="default" w:ascii="Calibri" w:hAnsi="Calibri" w:eastAsia="SimSun" w:cs="Calibri"/>
                 <w:sz w:val="24"/>
                 <w:szCs w:val="24"/>
@@ -7113,7 +7599,7 @@
             </w:r>
             <w:r>
               <w:rPr>
-                <w:rStyle w:val="15"/>
+                <w:rStyle w:val="16"/>
                 <w:rFonts w:hint="default" w:ascii="Calibri" w:hAnsi="Calibri" w:eastAsia="SimSun" w:cs="Calibri"/>
                 <w:sz w:val="24"/>
                 <w:szCs w:val="24"/>
@@ -7221,7 +7707,7 @@
         <mc:AlternateContent>
           <mc:Choice Requires="wps">
             <w:drawing>
-              <wp:anchor distT="0" distB="0" distL="114300" distR="114300" simplePos="0" relativeHeight="251667456" behindDoc="0" locked="0" layoutInCell="1" allowOverlap="1">
+              <wp:anchor distT="0" distB="0" distL="114300" distR="114300" simplePos="0" relativeHeight="251666432" behindDoc="0" locked="0" layoutInCell="1" allowOverlap="1">
                 <wp:simplePos x="0" y="0"/>
                 <wp:positionH relativeFrom="column">
                   <wp:posOffset>-131445</wp:posOffset>
@@ -7367,7 +7853,7 @@
           </mc:Choice>
           <mc:Fallback>
             <w:pict>
-              <v:shape id="_x0000_s1026" o:spid="_x0000_s1026" o:spt="202" type="#_x0000_t202" style="position:absolute;left:0pt;margin-left:-10.35pt;margin-top:-3.25pt;height:288.2pt;width:504.1pt;z-index:251667456;mso-width-relative:page;mso-height-relative:page;" fillcolor="#F4F9F5" filled="t" stroked="t" coordsize="21600,21600" o:gfxdata="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">
+              <v:shape id="_x0000_s1026" o:spid="_x0000_s1026" o:spt="202" type="#_x0000_t202" style="position:absolute;left:0pt;margin-left:-10.35pt;margin-top:-3.25pt;height:288.2pt;width:504.1pt;z-index:251666432;mso-width-relative:page;mso-height-relative:page;" fillcolor="#F4F9F5" filled="t" stroked="t" coordsize="21600,21600" o:gfxdata="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">
                 <v:fill on="t" focussize="0,0"/>
                 <v:stroke color="#000000 [3213]" joinstyle="round" dashstyle="dash"/>
                 <v:imagedata o:title=""/>
@@ -7808,7 +8294,7 @@
             </w:r>
             <w:r>
               <w:rPr>
-                <w:rStyle w:val="15"/>
+                <w:rStyle w:val="16"/>
                 <w:rFonts w:hint="default" w:ascii="Calibri" w:hAnsi="Calibri" w:eastAsia="SimSun" w:cs="Calibri"/>
                 <w:sz w:val="24"/>
                 <w:szCs w:val="24"/>
@@ -7817,7 +8303,7 @@
             </w:r>
             <w:r>
               <w:rPr>
-                <w:rStyle w:val="15"/>
+                <w:rStyle w:val="16"/>
                 <w:rFonts w:hint="default" w:ascii="Calibri" w:hAnsi="Calibri" w:eastAsia="SimSun" w:cs="Calibri"/>
                 <w:sz w:val="24"/>
                 <w:szCs w:val="24"/>
@@ -7839,7 +8325,12 @@
             <w:pPr>
               <w:spacing w:before="60" w:after="60"/>
               <w:rPr>
-                <w:rFonts w:hint="default"/>
+                <w:rFonts w:hint="default" w:cs="Arial"/>
+                <w:b/>
+                <w:bCs/>
+                <w:color w:val="DC2626"/>
+                <w:sz w:val="20"/>
+                <w:szCs w:val="20"/>
                 <w:lang w:val="en-US"/>
               </w:rPr>
             </w:pPr>
@@ -7876,6 +8367,55 @@
                 <w:lang w:val="en-US"/>
               </w:rPr>
               <w:t>1 No Token</w:t>
+            </w:r>
+          </w:p>
+          <w:p>
+            <w:pPr>
+              <w:spacing w:before="60" w:after="40"/>
+              <w:rPr>
+                <w:rFonts w:hint="default" w:cs="Arial"/>
+                <w:b/>
+                <w:bCs/>
+                <w:color w:val="DC2626"/>
+                <w:sz w:val="20"/>
+                <w:szCs w:val="20"/>
+                <w:lang w:val="en-IN"/>
+              </w:rPr>
+            </w:pPr>
+            <w:r>
+              <w:rPr>
+                <w:rFonts w:hint="default" w:cs="Arial"/>
+                <w:b/>
+                <w:bCs/>
+                <w:color w:val="374151"/>
+                <w:sz w:val="20"/>
+                <w:szCs w:val="20"/>
+                <w:lang w:val="en-IN"/>
+              </w:rPr>
+              <w:t>Authorization</w:t>
+            </w:r>
+            <w:r>
+              <w:rPr>
+                <w:rFonts w:ascii="Arial" w:hAnsi="Arial" w:eastAsia="Arial" w:cs="Arial"/>
+                <w:b/>
+                <w:bCs/>
+                <w:color w:val="374151"/>
+                <w:sz w:val="20"/>
+                <w:szCs w:val="20"/>
+              </w:rPr>
+              <w:t>:</w:t>
+            </w:r>
+            <w:r>
+              <w:rPr>
+                <w:rFonts w:hint="default" w:cs="Arial"/>
+                <w:b/>
+                <w:bCs/>
+                <w:color w:val="374151"/>
+                <w:sz w:val="20"/>
+                <w:szCs w:val="20"/>
+                <w:lang w:val="en-IN"/>
+              </w:rPr>
+              <w:t xml:space="preserve"> ____________</w:t>
             </w:r>
           </w:p>
           <w:p>
@@ -7929,7 +8469,7 @@
         <mc:AlternateContent>
           <mc:Choice Requires="wps">
             <w:drawing>
-              <wp:anchor distT="0" distB="0" distL="114300" distR="114300" simplePos="0" relativeHeight="251668480" behindDoc="0" locked="0" layoutInCell="1" allowOverlap="1">
+              <wp:anchor distT="0" distB="0" distL="114300" distR="114300" simplePos="0" relativeHeight="251667456" behindDoc="0" locked="0" layoutInCell="1" allowOverlap="1">
                 <wp:simplePos x="0" y="0"/>
                 <wp:positionH relativeFrom="column">
                   <wp:posOffset>-131445</wp:posOffset>
@@ -8075,7 +8615,7 @@
           </mc:Choice>
           <mc:Fallback>
             <w:pict>
-              <v:shape id="_x0000_s1026" o:spid="_x0000_s1026" o:spt="202" type="#_x0000_t202" style="position:absolute;left:0pt;margin-left:-10.35pt;margin-top:-3.25pt;height:288.2pt;width:504.1pt;z-index:251668480;mso-width-relative:page;mso-height-relative:page;" fillcolor="#F4F9F5" filled="t" stroked="t" coordsize="21600,21600" o:gfxdata="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">
+              <v:shape id="_x0000_s1026" o:spid="_x0000_s1026" o:spt="202" type="#_x0000_t202" style="position:absolute;left:0pt;margin-left:-10.35pt;margin-top:-3.25pt;height:288.2pt;width:504.1pt;z-index:251667456;mso-width-relative:page;mso-height-relative:page;" fillcolor="#F4F9F5" filled="t" stroked="t" coordsize="21600,21600" o:gfxdata="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">
                 <v:fill on="t" focussize="0,0"/>
                 <v:stroke color="#000000 [3213]" joinstyle="round" dashstyle="dash"/>
                 <v:imagedata o:title=""/>
@@ -8546,7 +9086,7 @@
             </w:r>
             <w:r>
               <w:rPr>
-                <w:rStyle w:val="15"/>
+                <w:rStyle w:val="16"/>
                 <w:rFonts w:hint="default" w:ascii="Calibri" w:hAnsi="Calibri" w:eastAsia="SimSun" w:cs="Calibri"/>
                 <w:sz w:val="24"/>
                 <w:szCs w:val="24"/>
@@ -8555,7 +9095,7 @@
             </w:r>
             <w:r>
               <w:rPr>
-                <w:rStyle w:val="15"/>
+                <w:rStyle w:val="16"/>
                 <w:rFonts w:hint="default" w:ascii="Calibri" w:hAnsi="Calibri" w:eastAsia="SimSun" w:cs="Calibri"/>
                 <w:sz w:val="24"/>
                 <w:szCs w:val="24"/>
@@ -8577,7 +9117,12 @@
             <w:pPr>
               <w:spacing w:before="60" w:after="60"/>
               <w:rPr>
-                <w:rFonts w:hint="default"/>
+                <w:rFonts w:hint="default" w:cs="Arial"/>
+                <w:b/>
+                <w:bCs/>
+                <w:color w:val="DC2626"/>
+                <w:sz w:val="20"/>
+                <w:szCs w:val="20"/>
                 <w:lang w:val="en-US"/>
               </w:rPr>
             </w:pPr>
@@ -8614,6 +9159,67 @@
                 <w:lang w:val="en-US"/>
               </w:rPr>
               <w:t>1 Invalid Token</w:t>
+            </w:r>
+          </w:p>
+          <w:p>
+            <w:pPr>
+              <w:spacing w:before="60" w:after="40"/>
+              <w:rPr>
+                <w:rFonts w:hint="default" w:cs="Arial"/>
+                <w:b/>
+                <w:bCs/>
+                <w:color w:val="DC2626"/>
+                <w:sz w:val="20"/>
+                <w:szCs w:val="20"/>
+                <w:lang w:val="en-US"/>
+              </w:rPr>
+            </w:pPr>
+            <w:r>
+              <w:rPr>
+                <w:rFonts w:hint="default" w:cs="Arial"/>
+                <w:b/>
+                <w:bCs/>
+                <w:color w:val="374151"/>
+                <w:sz w:val="20"/>
+                <w:szCs w:val="20"/>
+                <w:lang w:val="en-IN"/>
+              </w:rPr>
+              <w:t>Authorization</w:t>
+            </w:r>
+            <w:r>
+              <w:rPr>
+                <w:rFonts w:ascii="Arial" w:hAnsi="Arial" w:eastAsia="Arial" w:cs="Arial"/>
+                <w:b/>
+                <w:bCs/>
+                <w:color w:val="374151"/>
+                <w:sz w:val="20"/>
+                <w:szCs w:val="20"/>
+              </w:rPr>
+              <w:t>:</w:t>
+            </w:r>
+            <w:r>
+              <w:rPr>
+                <w:rFonts w:hint="default" w:cs="Arial"/>
+                <w:b/>
+                <w:bCs/>
+                <w:color w:val="374151"/>
+                <w:sz w:val="20"/>
+                <w:szCs w:val="20"/>
+                <w:lang w:val="en-IN"/>
+              </w:rPr>
+              <w:t xml:space="preserve"> </w:t>
+            </w:r>
+            <w:r>
+              <w:rPr>
+                <w:rFonts w:hint="default" w:cs="Arial"/>
+                <w:b w:val="0"/>
+                <w:bCs w:val="0"/>
+                <w:color w:val="374151"/>
+                <w:sz w:val="18"/>
+                <w:szCs w:val="18"/>
+                <w:lang w:val="en-IN"/>
+              </w:rPr>
+              <w:t>Bearer invalid&lt;JWT TOKEN&gt;</w:t>
             </w:r>
           </w:p>
           <w:p>
@@ -8667,7 +9273,7 @@
         <mc:AlternateContent>
           <mc:Choice Requires="wps">
             <w:drawing>
-              <wp:anchor distT="0" distB="0" distL="114300" distR="114300" simplePos="0" relativeHeight="251669504" behindDoc="0" locked="0" layoutInCell="1" allowOverlap="1">
+              <wp:anchor distT="0" distB="0" distL="114300" distR="114300" simplePos="0" relativeHeight="251668480" behindDoc="0" locked="0" layoutInCell="1" allowOverlap="1">
                 <wp:simplePos x="0" y="0"/>
                 <wp:positionH relativeFrom="column">
                   <wp:posOffset>-131445</wp:posOffset>
@@ -8813,7 +9419,7 @@
           </mc:Choice>
           <mc:Fallback>
             <w:pict>
-              <v:shape id="_x0000_s1026" o:spid="_x0000_s1026" o:spt="202" type="#_x0000_t202" style="position:absolute;left:0pt;margin-left:-10.35pt;margin-top:-3.25pt;height:288.2pt;width:504.1pt;z-index:251669504;mso-width-relative:page;mso-height-relative:page;" fillcolor="#F4F9F5" filled="t" stroked="t" coordsize="21600,21600" o:gfxdata="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">
+              <v:shape id="_x0000_s1026" o:spid="_x0000_s1026" o:spt="202" type="#_x0000_t202" style="position:absolute;left:0pt;margin-left:-10.35pt;margin-top:-3.25pt;height:288.2pt;width:504.1pt;z-index:251668480;mso-width-relative:page;mso-height-relative:page;" fillcolor="#F4F9F5" filled="t" stroked="t" coordsize="21600,21600" o:gfxdata="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">
                 <v:fill on="t" focussize="0,0"/>
                 <v:stroke color="#000000 [3213]" joinstyle="round" dashstyle="dash"/>
                 <v:imagedata o:title=""/>
@@ -9027,10 +9633,7 @@
     </w:p>
     <w:p/>
     <w:p/>
-    <w:p>
-      <w:bookmarkStart w:id="0" w:name="_GoBack"/>
-      <w:bookmarkEnd w:id="0"/>
-    </w:p>
+    <w:p/>
     <w:sectPr>
       <w:pgSz w:w="12240" w:h="15840"/>
       <w:pgMar w:top="1080" w:right="1080" w:bottom="1080" w:left="1080" w:header="708" w:footer="708" w:gutter="0"/>
@@ -9144,14 +9747,14 @@
     <w:lsdException w:unhideWhenUsed="0" w:uiPriority="0" w:semiHidden="0" w:name="Document Map"/>
     <w:lsdException w:unhideWhenUsed="0" w:uiPriority="0" w:semiHidden="0" w:name="Plain Text"/>
     <w:lsdException w:unhideWhenUsed="0" w:uiPriority="0" w:semiHidden="0" w:name="E-mail Signature"/>
-    <w:lsdException w:unhideWhenUsed="0" w:uiPriority="0" w:semiHidden="0" w:name="Normal (Web)"/>
+    <w:lsdException w:qFormat="1" w:unhideWhenUsed="0" w:uiPriority="0" w:semiHidden="0" w:name="Normal (Web)"/>
     <w:lsdException w:unhideWhenUsed="0" w:uiPriority="0" w:semiHidden="0" w:name="HTML Acronym"/>
     <w:lsdException w:unhideWhenUsed="0" w:uiPriority="0" w:semiHidden="0" w:name="HTML Address"/>
     <w:lsdException w:unhideWhenUsed="0" w:uiPriority="0" w:semiHidden="0" w:name="HTML Cite"/>
     <w:lsdException w:qFormat="1" w:uiPriority="99" w:name="HTML Code"/>
     <w:lsdException w:unhideWhenUsed="0" w:uiPriority="0" w:semiHidden="0" w:name="HTML Definition"/>
     <w:lsdException w:unhideWhenUsed="0" w:uiPriority="0" w:semiHidden="0" w:name="HTML Keyboard"/>
-    <w:lsdException w:unhideWhenUsed="0" w:uiPriority="0" w:semiHidden="0" w:name="HTML Preformatted"/>
+    <w:lsdException w:qFormat="1" w:unhideWhenUsed="0" w:uiPriority="0" w:semiHidden="0" w:name="HTML Preformatted"/>
     <w:lsdException w:unhideWhenUsed="0" w:uiPriority="0" w:semiHidden="0" w:name="HTML Sample"/>
     <w:lsdException w:unhideWhenUsed="0" w:uiPriority="0" w:semiHidden="0" w:name="HTML Typewriter"/>
     <w:lsdException w:unhideWhenUsed="0" w:uiPriority="0" w:semiHidden="0" w:name="HTML Variable"/>
@@ -9420,7 +10023,7 @@
   </w:style>
   <w:style w:type="paragraph" w:styleId="11">
     <w:name w:val="endnote text"/>
-    <w:link w:val="19"/>
+    <w:link w:val="21"/>
     <w:semiHidden/>
     <w:unhideWhenUsed/>
     <w:qFormat/>
@@ -9446,7 +10049,7 @@
   </w:style>
   <w:style w:type="paragraph" w:styleId="13">
     <w:name w:val="footnote text"/>
-    <w:link w:val="18"/>
+    <w:link w:val="20"/>
     <w:semiHidden/>
     <w:unhideWhenUsed/>
     <w:qFormat/>
@@ -9473,7 +10076,40 @@
       <w:szCs w:val="20"/>
     </w:rPr>
   </w:style>
-  <w:style w:type="character" w:styleId="15">
+  <w:style w:type="paragraph" w:styleId="15">
+    <w:name w:val="HTML Preformatted"/>
+    <w:qFormat/>
+    <w:uiPriority w:val="0"/>
+    <w:pPr>
+      <w:tabs>
+        <w:tab w:val="left" w:pos="916"/>
+        <w:tab w:val="left" w:pos="1832"/>
+        <w:tab w:val="left" w:pos="2748"/>
+        <w:tab w:val="left" w:pos="3664"/>
+        <w:tab w:val="left" w:pos="4580"/>
+        <w:tab w:val="left" w:pos="5496"/>
+        <w:tab w:val="left" w:pos="6412"/>
+        <w:tab w:val="left" w:pos="7328"/>
+        <w:tab w:val="left" w:pos="8244"/>
+        <w:tab w:val="left" w:pos="9160"/>
+        <w:tab w:val="left" w:pos="10076"/>
+        <w:tab w:val="left" w:pos="10992"/>
+        <w:tab w:val="left" w:pos="11908"/>
+        <w:tab w:val="left" w:pos="12824"/>
+        <w:tab w:val="left" w:pos="13740"/>
+        <w:tab w:val="left" w:pos="14656"/>
+      </w:tabs>
+      <w:jc w:val="left"/>
+    </w:pPr>
+    <w:rPr>
+      <w:rFonts w:hint="eastAsia" w:ascii="SimSun" w:hAnsi="SimSun" w:eastAsia="SimSun" w:cs="SimSun"/>
+      <w:kern w:val="0"/>
+      <w:sz w:val="24"/>
+      <w:szCs w:val="24"/>
+      <w:lang w:val="en-US" w:eastAsia="zh-CN" w:bidi="ar"/>
+    </w:rPr>
+  </w:style>
+  <w:style w:type="character" w:styleId="16">
     <w:name w:val="Hyperlink"/>
     <w:basedOn w:val="8"/>
     <w:unhideWhenUsed/>
@@ -9484,7 +10120,17 @@
       <w:u w:val="single"/>
     </w:rPr>
   </w:style>
-  <w:style w:type="paragraph" w:styleId="16">
+  <w:style w:type="paragraph" w:styleId="17">
+    <w:name w:val="Normal (Web)"/>
+    <w:basedOn w:val="1"/>
+    <w:qFormat/>
+    <w:uiPriority w:val="0"/>
+    <w:rPr>
+      <w:sz w:val="24"/>
+      <w:szCs w:val="24"/>
+    </w:rPr>
+  </w:style>
+  <w:style w:type="paragraph" w:styleId="18">
     <w:name w:val="Title"/>
     <w:qFormat/>
     <w:uiPriority w:val="0"/>
@@ -9494,7 +10140,7 @@
       <w:szCs w:val="56"/>
     </w:rPr>
   </w:style>
-  <w:style w:type="paragraph" w:styleId="17">
+  <w:style w:type="paragraph" w:styleId="19">
     <w:name w:val="List Paragraph"/>
     <w:qFormat/>
     <w:uiPriority w:val="0"/>
@@ -9504,7 +10150,7 @@
       <w:szCs w:val="20"/>
     </w:rPr>
   </w:style>
-  <w:style w:type="character" w:customStyle="1" w:styleId="18">
+  <w:style w:type="character" w:customStyle="1" w:styleId="20">
     <w:name w:val="Footnote Text Char"/>
     <w:link w:val="13"/>
     <w:semiHidden/>
@@ -9516,7 +10162,7 @@
       <w:szCs w:val="20"/>
     </w:rPr>
   </w:style>
-  <w:style w:type="character" w:customStyle="1" w:styleId="19">
+  <w:style w:type="character" w:customStyle="1" w:styleId="21">
     <w:name w:val="Endnote Text Char"/>
     <w:link w:val="11"/>
     <w:semiHidden/>

</xml_diff>